<commit_message>
docs(requirements): add requirements report v2 with traceability
docs/TestZede-Gereksinim-Raporu-v2.md and .docx list GER-001..GER-053
(functional, non-functional, constraints, project deliverables) with
type, priority, source and verification method, trace each one to the
SDD and to STD 3.1-3.9, and mark STD coverage gaps. No v1 was found in
the repo, so the change summary is against the contract annexes
EK-A..EK-D. Items that need a team decision (whether EK-A..EK-D stand in
for the "Yazılım Şartnamesi" deliverable, document fixes) are listed,
not decided.

md_to_docx: fixed table layout sized by average cell length, italics,
escaped pipes in table cells. SDD .docx rebuilt with these fixes.

Co-Authored-By: Claude Opus 5.5 <noreply@anthropic.com>
</commit_message>
<xml_diff>
--- a/docs/TestZede-SDD.docx
+++ b/docs/TestZede-SDD.docx
@@ -260,16 +260,18 @@
       <w:tblPr>
         <w:tblW w:type="auto" w:w="0"/>
         <w:jc w:val="center"/>
+        <w:tblLayout w:type="fixed"/>
         <w:tblLook w:firstColumn="1" w:firstRow="1" w:lastColumn="0" w:lastRow="0" w:noHBand="0" w:noVBand="1" w:val="04A0"/>
+        <w:tblLayout w:type="fixed"/>
       </w:tblPr>
       <w:tblGrid>
-        <w:gridCol w:w="4513"/>
-        <w:gridCol w:w="4513"/>
+        <w:gridCol w:w="1628"/>
+        <w:gridCol w:w="7398"/>
       </w:tblGrid>
       <w:tr>
         <w:tc>
           <w:tcPr>
-            <w:tcW w:type="dxa" w:w="2171"/>
+            <w:tcW w:type="dxa" w:w="1628"/>
             <w:tcBorders>
               <w:top w:val="single" w:sz="4" w:space="0" w:color="8C8C8C"/>
               <w:left w:val="single" w:sz="4" w:space="0" w:color="8C8C8C"/>
@@ -299,7 +301,7 @@
         </w:tc>
         <w:tc>
           <w:tcPr>
-            <w:tcW w:type="dxa" w:w="6855"/>
+            <w:tcW w:type="dxa" w:w="7398"/>
             <w:tcBorders>
               <w:top w:val="single" w:sz="4" w:space="0" w:color="8C8C8C"/>
               <w:left w:val="single" w:sz="4" w:space="0" w:color="8C8C8C"/>
@@ -331,7 +333,7 @@
       <w:tr>
         <w:tc>
           <w:tcPr>
-            <w:tcW w:type="dxa" w:w="2171"/>
+            <w:tcW w:type="dxa" w:w="1628"/>
             <w:tcBorders>
               <w:top w:val="single" w:sz="4" w:space="0" w:color="8C8C8C"/>
               <w:left w:val="single" w:sz="4" w:space="0" w:color="8C8C8C"/>
@@ -372,7 +374,7 @@
         </w:tc>
         <w:tc>
           <w:tcPr>
-            <w:tcW w:type="dxa" w:w="6855"/>
+            <w:tcW w:type="dxa" w:w="7398"/>
             <w:tcBorders>
               <w:top w:val="single" w:sz="4" w:space="0" w:color="8C8C8C"/>
               <w:left w:val="single" w:sz="4" w:space="0" w:color="8C8C8C"/>
@@ -402,7 +404,7 @@
       <w:tr>
         <w:tc>
           <w:tcPr>
-            <w:tcW w:type="dxa" w:w="2171"/>
+            <w:tcW w:type="dxa" w:w="1628"/>
             <w:tcBorders>
               <w:top w:val="single" w:sz="4" w:space="0" w:color="8C8C8C"/>
               <w:left w:val="single" w:sz="4" w:space="0" w:color="8C8C8C"/>
@@ -430,7 +432,7 @@
         </w:tc>
         <w:tc>
           <w:tcPr>
-            <w:tcW w:type="dxa" w:w="6855"/>
+            <w:tcW w:type="dxa" w:w="7398"/>
             <w:tcBorders>
               <w:top w:val="single" w:sz="4" w:space="0" w:color="8C8C8C"/>
               <w:left w:val="single" w:sz="4" w:space="0" w:color="8C8C8C"/>
@@ -473,7 +475,7 @@
       <w:tr>
         <w:tc>
           <w:tcPr>
-            <w:tcW w:type="dxa" w:w="2171"/>
+            <w:tcW w:type="dxa" w:w="1628"/>
             <w:tcBorders>
               <w:top w:val="single" w:sz="4" w:space="0" w:color="8C8C8C"/>
               <w:left w:val="single" w:sz="4" w:space="0" w:color="8C8C8C"/>
@@ -501,7 +503,7 @@
         </w:tc>
         <w:tc>
           <w:tcPr>
-            <w:tcW w:type="dxa" w:w="6855"/>
+            <w:tcW w:type="dxa" w:w="7398"/>
             <w:tcBorders>
               <w:top w:val="single" w:sz="4" w:space="0" w:color="8C8C8C"/>
               <w:left w:val="single" w:sz="4" w:space="0" w:color="8C8C8C"/>
@@ -531,7 +533,7 @@
       <w:tr>
         <w:tc>
           <w:tcPr>
-            <w:tcW w:type="dxa" w:w="2171"/>
+            <w:tcW w:type="dxa" w:w="1628"/>
             <w:tcBorders>
               <w:top w:val="single" w:sz="4" w:space="0" w:color="8C8C8C"/>
               <w:left w:val="single" w:sz="4" w:space="0" w:color="8C8C8C"/>
@@ -559,7 +561,7 @@
         </w:tc>
         <w:tc>
           <w:tcPr>
-            <w:tcW w:type="dxa" w:w="6855"/>
+            <w:tcW w:type="dxa" w:w="7398"/>
             <w:tcBorders>
               <w:top w:val="single" w:sz="4" w:space="0" w:color="8C8C8C"/>
               <w:left w:val="single" w:sz="4" w:space="0" w:color="8C8C8C"/>
@@ -602,7 +604,7 @@
       <w:tr>
         <w:tc>
           <w:tcPr>
-            <w:tcW w:type="dxa" w:w="2171"/>
+            <w:tcW w:type="dxa" w:w="1628"/>
             <w:tcBorders>
               <w:top w:val="single" w:sz="4" w:space="0" w:color="8C8C8C"/>
               <w:left w:val="single" w:sz="4" w:space="0" w:color="8C8C8C"/>
@@ -630,7 +632,7 @@
         </w:tc>
         <w:tc>
           <w:tcPr>
-            <w:tcW w:type="dxa" w:w="6855"/>
+            <w:tcW w:type="dxa" w:w="7398"/>
             <w:tcBorders>
               <w:top w:val="single" w:sz="4" w:space="0" w:color="8C8C8C"/>
               <w:left w:val="single" w:sz="4" w:space="0" w:color="8C8C8C"/>
@@ -660,7 +662,7 @@
       <w:tr>
         <w:tc>
           <w:tcPr>
-            <w:tcW w:type="dxa" w:w="2171"/>
+            <w:tcW w:type="dxa" w:w="1628"/>
             <w:tcBorders>
               <w:top w:val="single" w:sz="4" w:space="0" w:color="8C8C8C"/>
               <w:left w:val="single" w:sz="4" w:space="0" w:color="8C8C8C"/>
@@ -688,7 +690,7 @@
         </w:tc>
         <w:tc>
           <w:tcPr>
-            <w:tcW w:type="dxa" w:w="6855"/>
+            <w:tcW w:type="dxa" w:w="7398"/>
             <w:tcBorders>
               <w:top w:val="single" w:sz="4" w:space="0" w:color="8C8C8C"/>
               <w:left w:val="single" w:sz="4" w:space="0" w:color="8C8C8C"/>
@@ -725,7 +727,7 @@
       <w:tr>
         <w:tc>
           <w:tcPr>
-            <w:tcW w:type="dxa" w:w="2171"/>
+            <w:tcW w:type="dxa" w:w="1628"/>
             <w:tcBorders>
               <w:top w:val="single" w:sz="4" w:space="0" w:color="8C8C8C"/>
               <w:left w:val="single" w:sz="4" w:space="0" w:color="8C8C8C"/>
@@ -753,7 +755,7 @@
         </w:tc>
         <w:tc>
           <w:tcPr>
-            <w:tcW w:type="dxa" w:w="6855"/>
+            <w:tcW w:type="dxa" w:w="7398"/>
             <w:tcBorders>
               <w:top w:val="single" w:sz="4" w:space="0" w:color="8C8C8C"/>
               <w:left w:val="single" w:sz="4" w:space="0" w:color="8C8C8C"/>
@@ -783,7 +785,7 @@
       <w:tr>
         <w:tc>
           <w:tcPr>
-            <w:tcW w:type="dxa" w:w="2171"/>
+            <w:tcW w:type="dxa" w:w="1628"/>
             <w:tcBorders>
               <w:top w:val="single" w:sz="4" w:space="0" w:color="8C8C8C"/>
               <w:left w:val="single" w:sz="4" w:space="0" w:color="8C8C8C"/>
@@ -811,7 +813,7 @@
         </w:tc>
         <w:tc>
           <w:tcPr>
-            <w:tcW w:type="dxa" w:w="6855"/>
+            <w:tcW w:type="dxa" w:w="7398"/>
             <w:tcBorders>
               <w:top w:val="single" w:sz="4" w:space="0" w:color="8C8C8C"/>
               <w:left w:val="single" w:sz="4" w:space="0" w:color="8C8C8C"/>
@@ -880,7 +882,7 @@
       <w:tr>
         <w:tc>
           <w:tcPr>
-            <w:tcW w:type="dxa" w:w="2171"/>
+            <w:tcW w:type="dxa" w:w="1628"/>
             <w:tcBorders>
               <w:top w:val="single" w:sz="4" w:space="0" w:color="8C8C8C"/>
               <w:left w:val="single" w:sz="4" w:space="0" w:color="8C8C8C"/>
@@ -908,7 +910,7 @@
         </w:tc>
         <w:tc>
           <w:tcPr>
-            <w:tcW w:type="dxa" w:w="6855"/>
+            <w:tcW w:type="dxa" w:w="7398"/>
             <w:tcBorders>
               <w:top w:val="single" w:sz="4" w:space="0" w:color="8C8C8C"/>
               <w:left w:val="single" w:sz="4" w:space="0" w:color="8C8C8C"/>
@@ -951,7 +953,7 @@
       <w:tr>
         <w:tc>
           <w:tcPr>
-            <w:tcW w:type="dxa" w:w="2171"/>
+            <w:tcW w:type="dxa" w:w="1628"/>
             <w:tcBorders>
               <w:top w:val="single" w:sz="4" w:space="0" w:color="8C8C8C"/>
               <w:left w:val="single" w:sz="4" w:space="0" w:color="8C8C8C"/>
@@ -979,7 +981,7 @@
         </w:tc>
         <w:tc>
           <w:tcPr>
-            <w:tcW w:type="dxa" w:w="6855"/>
+            <w:tcW w:type="dxa" w:w="7398"/>
             <w:tcBorders>
               <w:top w:val="single" w:sz="4" w:space="0" w:color="8C8C8C"/>
               <w:left w:val="single" w:sz="4" w:space="0" w:color="8C8C8C"/>
@@ -1009,7 +1011,7 @@
       <w:tr>
         <w:tc>
           <w:tcPr>
-            <w:tcW w:type="dxa" w:w="2171"/>
+            <w:tcW w:type="dxa" w:w="1628"/>
             <w:tcBorders>
               <w:top w:val="single" w:sz="4" w:space="0" w:color="8C8C8C"/>
               <w:left w:val="single" w:sz="4" w:space="0" w:color="8C8C8C"/>
@@ -1037,7 +1039,7 @@
         </w:tc>
         <w:tc>
           <w:tcPr>
-            <w:tcW w:type="dxa" w:w="6855"/>
+            <w:tcW w:type="dxa" w:w="7398"/>
             <w:tcBorders>
               <w:top w:val="single" w:sz="4" w:space="0" w:color="8C8C8C"/>
               <w:left w:val="single" w:sz="4" w:space="0" w:color="8C8C8C"/>
@@ -2072,17 +2074,19 @@
       <w:tblPr>
         <w:tblW w:type="auto" w:w="0"/>
         <w:jc w:val="center"/>
+        <w:tblLayout w:type="fixed"/>
         <w:tblLook w:firstColumn="1" w:firstRow="1" w:lastColumn="0" w:lastRow="0" w:noHBand="0" w:noVBand="1" w:val="04A0"/>
+        <w:tblLayout w:type="fixed"/>
       </w:tblPr>
       <w:tblGrid>
-        <w:gridCol w:w="3009"/>
-        <w:gridCol w:w="3009"/>
-        <w:gridCol w:w="3009"/>
+        <w:gridCol w:w="1840"/>
+        <w:gridCol w:w="3874"/>
+        <w:gridCol w:w="3312"/>
       </w:tblGrid>
       <w:tr>
         <w:tc>
           <w:tcPr>
-            <w:tcW w:type="dxa" w:w="2212"/>
+            <w:tcW w:type="dxa" w:w="1840"/>
             <w:tcBorders>
               <w:top w:val="single" w:sz="4" w:space="0" w:color="8C8C8C"/>
               <w:left w:val="single" w:sz="4" w:space="0" w:color="8C8C8C"/>
@@ -2112,7 +2116,7 @@
         </w:tc>
         <w:tc>
           <w:tcPr>
-            <w:tcW w:type="dxa" w:w="3586"/>
+            <w:tcW w:type="dxa" w:w="3874"/>
             <w:tcBorders>
               <w:top w:val="single" w:sz="4" w:space="0" w:color="8C8C8C"/>
               <w:left w:val="single" w:sz="4" w:space="0" w:color="8C8C8C"/>
@@ -2142,7 +2146,7 @@
         </w:tc>
         <w:tc>
           <w:tcPr>
-            <w:tcW w:type="dxa" w:w="3228"/>
+            <w:tcW w:type="dxa" w:w="3312"/>
             <w:tcBorders>
               <w:top w:val="single" w:sz="4" w:space="0" w:color="8C8C8C"/>
               <w:left w:val="single" w:sz="4" w:space="0" w:color="8C8C8C"/>
@@ -2174,7 +2178,7 @@
       <w:tr>
         <w:tc>
           <w:tcPr>
-            <w:tcW w:type="dxa" w:w="2212"/>
+            <w:tcW w:type="dxa" w:w="1840"/>
             <w:tcBorders>
               <w:top w:val="single" w:sz="4" w:space="0" w:color="8C8C8C"/>
               <w:left w:val="single" w:sz="4" w:space="0" w:color="8C8C8C"/>
@@ -2202,7 +2206,7 @@
         </w:tc>
         <w:tc>
           <w:tcPr>
-            <w:tcW w:type="dxa" w:w="3586"/>
+            <w:tcW w:type="dxa" w:w="3874"/>
             <w:tcBorders>
               <w:top w:val="single" w:sz="4" w:space="0" w:color="8C8C8C"/>
               <w:left w:val="single" w:sz="4" w:space="0" w:color="8C8C8C"/>
@@ -2230,7 +2234,7 @@
         </w:tc>
         <w:tc>
           <w:tcPr>
-            <w:tcW w:type="dxa" w:w="3228"/>
+            <w:tcW w:type="dxa" w:w="3312"/>
             <w:tcBorders>
               <w:top w:val="single" w:sz="4" w:space="0" w:color="8C8C8C"/>
               <w:left w:val="single" w:sz="4" w:space="0" w:color="8C8C8C"/>
@@ -2274,7 +2278,7 @@
       <w:tr>
         <w:tc>
           <w:tcPr>
-            <w:tcW w:type="dxa" w:w="2212"/>
+            <w:tcW w:type="dxa" w:w="1840"/>
             <w:tcBorders>
               <w:top w:val="single" w:sz="4" w:space="0" w:color="8C8C8C"/>
               <w:left w:val="single" w:sz="4" w:space="0" w:color="8C8C8C"/>
@@ -2309,7 +2313,7 @@
         </w:tc>
         <w:tc>
           <w:tcPr>
-            <w:tcW w:type="dxa" w:w="3586"/>
+            <w:tcW w:type="dxa" w:w="3874"/>
             <w:tcBorders>
               <w:top w:val="single" w:sz="4" w:space="0" w:color="8C8C8C"/>
               <w:left w:val="single" w:sz="4" w:space="0" w:color="8C8C8C"/>
@@ -2337,7 +2341,7 @@
         </w:tc>
         <w:tc>
           <w:tcPr>
-            <w:tcW w:type="dxa" w:w="3228"/>
+            <w:tcW w:type="dxa" w:w="3312"/>
             <w:tcBorders>
               <w:top w:val="single" w:sz="4" w:space="0" w:color="8C8C8C"/>
               <w:left w:val="single" w:sz="4" w:space="0" w:color="8C8C8C"/>
@@ -2400,7 +2404,7 @@
       <w:tr>
         <w:tc>
           <w:tcPr>
-            <w:tcW w:type="dxa" w:w="2212"/>
+            <w:tcW w:type="dxa" w:w="1840"/>
             <w:tcBorders>
               <w:top w:val="single" w:sz="4" w:space="0" w:color="8C8C8C"/>
               <w:left w:val="single" w:sz="4" w:space="0" w:color="8C8C8C"/>
@@ -2428,7 +2432,7 @@
         </w:tc>
         <w:tc>
           <w:tcPr>
-            <w:tcW w:type="dxa" w:w="3586"/>
+            <w:tcW w:type="dxa" w:w="3874"/>
             <w:tcBorders>
               <w:top w:val="single" w:sz="4" w:space="0" w:color="8C8C8C"/>
               <w:left w:val="single" w:sz="4" w:space="0" w:color="8C8C8C"/>
@@ -2469,7 +2473,7 @@
         </w:tc>
         <w:tc>
           <w:tcPr>
-            <w:tcW w:type="dxa" w:w="3228"/>
+            <w:tcW w:type="dxa" w:w="3312"/>
             <w:tcBorders>
               <w:top w:val="single" w:sz="4" w:space="0" w:color="8C8C8C"/>
               <w:left w:val="single" w:sz="4" w:space="0" w:color="8C8C8C"/>
@@ -2519,7 +2523,7 @@
       <w:tr>
         <w:tc>
           <w:tcPr>
-            <w:tcW w:type="dxa" w:w="2212"/>
+            <w:tcW w:type="dxa" w:w="1840"/>
             <w:tcBorders>
               <w:top w:val="single" w:sz="4" w:space="0" w:color="8C8C8C"/>
               <w:left w:val="single" w:sz="4" w:space="0" w:color="8C8C8C"/>
@@ -2560,7 +2564,7 @@
         </w:tc>
         <w:tc>
           <w:tcPr>
-            <w:tcW w:type="dxa" w:w="3586"/>
+            <w:tcW w:type="dxa" w:w="3874"/>
             <w:tcBorders>
               <w:top w:val="single" w:sz="4" w:space="0" w:color="8C8C8C"/>
               <w:left w:val="single" w:sz="4" w:space="0" w:color="8C8C8C"/>
@@ -2595,7 +2599,7 @@
         </w:tc>
         <w:tc>
           <w:tcPr>
-            <w:tcW w:type="dxa" w:w="3228"/>
+            <w:tcW w:type="dxa" w:w="3312"/>
             <w:tcBorders>
               <w:top w:val="single" w:sz="4" w:space="0" w:color="8C8C8C"/>
               <w:left w:val="single" w:sz="4" w:space="0" w:color="8C8C8C"/>
@@ -2725,16 +2729,18 @@
       <w:tblPr>
         <w:tblW w:type="auto" w:w="0"/>
         <w:jc w:val="center"/>
+        <w:tblLayout w:type="fixed"/>
         <w:tblLook w:firstColumn="1" w:firstRow="1" w:lastColumn="0" w:lastRow="0" w:noHBand="0" w:noVBand="1" w:val="04A0"/>
+        <w:tblLayout w:type="fixed"/>
       </w:tblPr>
       <w:tblGrid>
-        <w:gridCol w:w="4513"/>
-        <w:gridCol w:w="4513"/>
+        <w:gridCol w:w="3824"/>
+        <w:gridCol w:w="5202"/>
       </w:tblGrid>
       <w:tr>
         <w:tc>
           <w:tcPr>
-            <w:tcW w:type="dxa" w:w="3965"/>
+            <w:tcW w:type="dxa" w:w="3824"/>
             <w:tcBorders>
               <w:top w:val="single" w:sz="4" w:space="0" w:color="8C8C8C"/>
               <w:left w:val="single" w:sz="4" w:space="0" w:color="8C8C8C"/>
@@ -2764,7 +2770,7 @@
         </w:tc>
         <w:tc>
           <w:tcPr>
-            <w:tcW w:type="dxa" w:w="5061"/>
+            <w:tcW w:type="dxa" w:w="5202"/>
             <w:tcBorders>
               <w:top w:val="single" w:sz="4" w:space="0" w:color="8C8C8C"/>
               <w:left w:val="single" w:sz="4" w:space="0" w:color="8C8C8C"/>
@@ -2796,7 +2802,7 @@
       <w:tr>
         <w:tc>
           <w:tcPr>
-            <w:tcW w:type="dxa" w:w="3965"/>
+            <w:tcW w:type="dxa" w:w="3824"/>
             <w:tcBorders>
               <w:top w:val="single" w:sz="4" w:space="0" w:color="8C8C8C"/>
               <w:left w:val="single" w:sz="4" w:space="0" w:color="8C8C8C"/>
@@ -2844,7 +2850,7 @@
         </w:tc>
         <w:tc>
           <w:tcPr>
-            <w:tcW w:type="dxa" w:w="5061"/>
+            <w:tcW w:type="dxa" w:w="5202"/>
             <w:tcBorders>
               <w:top w:val="single" w:sz="4" w:space="0" w:color="8C8C8C"/>
               <w:left w:val="single" w:sz="4" w:space="0" w:color="8C8C8C"/>
@@ -2894,7 +2900,7 @@
       <w:tr>
         <w:tc>
           <w:tcPr>
-            <w:tcW w:type="dxa" w:w="3965"/>
+            <w:tcW w:type="dxa" w:w="3824"/>
             <w:tcBorders>
               <w:top w:val="single" w:sz="4" w:space="0" w:color="8C8C8C"/>
               <w:left w:val="single" w:sz="4" w:space="0" w:color="8C8C8C"/>
@@ -2923,7 +2929,7 @@
         </w:tc>
         <w:tc>
           <w:tcPr>
-            <w:tcW w:type="dxa" w:w="5061"/>
+            <w:tcW w:type="dxa" w:w="5202"/>
             <w:tcBorders>
               <w:top w:val="single" w:sz="4" w:space="0" w:color="8C8C8C"/>
               <w:left w:val="single" w:sz="4" w:space="0" w:color="8C8C8C"/>
@@ -2953,7 +2959,7 @@
       <w:tr>
         <w:tc>
           <w:tcPr>
-            <w:tcW w:type="dxa" w:w="3965"/>
+            <w:tcW w:type="dxa" w:w="3824"/>
             <w:tcBorders>
               <w:top w:val="single" w:sz="4" w:space="0" w:color="8C8C8C"/>
               <w:left w:val="single" w:sz="4" w:space="0" w:color="8C8C8C"/>
@@ -2982,7 +2988,7 @@
         </w:tc>
         <w:tc>
           <w:tcPr>
-            <w:tcW w:type="dxa" w:w="5061"/>
+            <w:tcW w:type="dxa" w:w="5202"/>
             <w:tcBorders>
               <w:top w:val="single" w:sz="4" w:space="0" w:color="8C8C8C"/>
               <w:left w:val="single" w:sz="4" w:space="0" w:color="8C8C8C"/>
@@ -3019,7 +3025,7 @@
       <w:tr>
         <w:tc>
           <w:tcPr>
-            <w:tcW w:type="dxa" w:w="3965"/>
+            <w:tcW w:type="dxa" w:w="3824"/>
             <w:tcBorders>
               <w:top w:val="single" w:sz="4" w:space="0" w:color="8C8C8C"/>
               <w:left w:val="single" w:sz="4" w:space="0" w:color="8C8C8C"/>
@@ -3048,7 +3054,7 @@
         </w:tc>
         <w:tc>
           <w:tcPr>
-            <w:tcW w:type="dxa" w:w="5061"/>
+            <w:tcW w:type="dxa" w:w="5202"/>
             <w:tcBorders>
               <w:top w:val="single" w:sz="4" w:space="0" w:color="8C8C8C"/>
               <w:left w:val="single" w:sz="4" w:space="0" w:color="8C8C8C"/>
@@ -4159,17 +4165,19 @@
       <w:tblPr>
         <w:tblW w:type="auto" w:w="0"/>
         <w:jc w:val="center"/>
+        <w:tblLayout w:type="fixed"/>
         <w:tblLook w:firstColumn="1" w:firstRow="1" w:lastColumn="0" w:lastRow="0" w:noHBand="0" w:noVBand="1" w:val="04A0"/>
+        <w:tblLayout w:type="fixed"/>
       </w:tblPr>
       <w:tblGrid>
-        <w:gridCol w:w="3009"/>
-        <w:gridCol w:w="3009"/>
-        <w:gridCol w:w="3009"/>
+        <w:gridCol w:w="1042"/>
+        <w:gridCol w:w="3246"/>
+        <w:gridCol w:w="4738"/>
       </w:tblGrid>
       <w:tr>
         <w:tc>
           <w:tcPr>
-            <w:tcW w:type="dxa" w:w="1493"/>
+            <w:tcW w:type="dxa" w:w="1042"/>
             <w:tcBorders>
               <w:top w:val="single" w:sz="4" w:space="0" w:color="8C8C8C"/>
               <w:left w:val="single" w:sz="4" w:space="0" w:color="8C8C8C"/>
@@ -4199,7 +4207,7 @@
         </w:tc>
         <w:tc>
           <w:tcPr>
-            <w:tcW w:type="dxa" w:w="3461"/>
+            <w:tcW w:type="dxa" w:w="3246"/>
             <w:tcBorders>
               <w:top w:val="single" w:sz="4" w:space="0" w:color="8C8C8C"/>
               <w:left w:val="single" w:sz="4" w:space="0" w:color="8C8C8C"/>
@@ -4229,7 +4237,7 @@
         </w:tc>
         <w:tc>
           <w:tcPr>
-            <w:tcW w:type="dxa" w:w="4072"/>
+            <w:tcW w:type="dxa" w:w="4738"/>
             <w:tcBorders>
               <w:top w:val="single" w:sz="4" w:space="0" w:color="8C8C8C"/>
               <w:left w:val="single" w:sz="4" w:space="0" w:color="8C8C8C"/>
@@ -4261,7 +4269,7 @@
       <w:tr>
         <w:tc>
           <w:tcPr>
-            <w:tcW w:type="dxa" w:w="1493"/>
+            <w:tcW w:type="dxa" w:w="1042"/>
             <w:tcBorders>
               <w:top w:val="single" w:sz="4" w:space="0" w:color="8C8C8C"/>
               <w:left w:val="single" w:sz="4" w:space="0" w:color="8C8C8C"/>
@@ -4289,7 +4297,7 @@
         </w:tc>
         <w:tc>
           <w:tcPr>
-            <w:tcW w:type="dxa" w:w="3461"/>
+            <w:tcW w:type="dxa" w:w="3246"/>
             <w:tcBorders>
               <w:top w:val="single" w:sz="4" w:space="0" w:color="8C8C8C"/>
               <w:left w:val="single" w:sz="4" w:space="0" w:color="8C8C8C"/>
@@ -4318,7 +4326,7 @@
         </w:tc>
         <w:tc>
           <w:tcPr>
-            <w:tcW w:type="dxa" w:w="4072"/>
+            <w:tcW w:type="dxa" w:w="4738"/>
             <w:tcBorders>
               <w:top w:val="single" w:sz="4" w:space="0" w:color="8C8C8C"/>
               <w:left w:val="single" w:sz="4" w:space="0" w:color="8C8C8C"/>
@@ -4374,7 +4382,7 @@
       <w:tr>
         <w:tc>
           <w:tcPr>
-            <w:tcW w:type="dxa" w:w="1493"/>
+            <w:tcW w:type="dxa" w:w="1042"/>
             <w:tcBorders>
               <w:top w:val="single" w:sz="4" w:space="0" w:color="8C8C8C"/>
               <w:left w:val="single" w:sz="4" w:space="0" w:color="8C8C8C"/>
@@ -4402,7 +4410,7 @@
         </w:tc>
         <w:tc>
           <w:tcPr>
-            <w:tcW w:type="dxa" w:w="3461"/>
+            <w:tcW w:type="dxa" w:w="3246"/>
             <w:tcBorders>
               <w:top w:val="single" w:sz="4" w:space="0" w:color="8C8C8C"/>
               <w:left w:val="single" w:sz="4" w:space="0" w:color="8C8C8C"/>
@@ -4457,7 +4465,7 @@
         </w:tc>
         <w:tc>
           <w:tcPr>
-            <w:tcW w:type="dxa" w:w="4072"/>
+            <w:tcW w:type="dxa" w:w="4738"/>
             <w:tcBorders>
               <w:top w:val="single" w:sz="4" w:space="0" w:color="8C8C8C"/>
               <w:left w:val="single" w:sz="4" w:space="0" w:color="8C8C8C"/>
@@ -4500,7 +4508,7 @@
       <w:tr>
         <w:tc>
           <w:tcPr>
-            <w:tcW w:type="dxa" w:w="1493"/>
+            <w:tcW w:type="dxa" w:w="1042"/>
             <w:tcBorders>
               <w:top w:val="single" w:sz="4" w:space="0" w:color="8C8C8C"/>
               <w:left w:val="single" w:sz="4" w:space="0" w:color="8C8C8C"/>
@@ -4528,7 +4536,7 @@
         </w:tc>
         <w:tc>
           <w:tcPr>
-            <w:tcW w:type="dxa" w:w="3461"/>
+            <w:tcW w:type="dxa" w:w="3246"/>
             <w:tcBorders>
               <w:top w:val="single" w:sz="4" w:space="0" w:color="8C8C8C"/>
               <w:left w:val="single" w:sz="4" w:space="0" w:color="8C8C8C"/>
@@ -4570,7 +4578,7 @@
         </w:tc>
         <w:tc>
           <w:tcPr>
-            <w:tcW w:type="dxa" w:w="4072"/>
+            <w:tcW w:type="dxa" w:w="4738"/>
             <w:tcBorders>
               <w:top w:val="single" w:sz="4" w:space="0" w:color="8C8C8C"/>
               <w:left w:val="single" w:sz="4" w:space="0" w:color="8C8C8C"/>
@@ -4704,7 +4712,7 @@
       <w:tr>
         <w:tc>
           <w:tcPr>
-            <w:tcW w:type="dxa" w:w="1493"/>
+            <w:tcW w:type="dxa" w:w="1042"/>
             <w:tcBorders>
               <w:top w:val="single" w:sz="4" w:space="0" w:color="8C8C8C"/>
               <w:left w:val="single" w:sz="4" w:space="0" w:color="8C8C8C"/>
@@ -4732,7 +4740,7 @@
         </w:tc>
         <w:tc>
           <w:tcPr>
-            <w:tcW w:type="dxa" w:w="3461"/>
+            <w:tcW w:type="dxa" w:w="3246"/>
             <w:tcBorders>
               <w:top w:val="single" w:sz="4" w:space="0" w:color="8C8C8C"/>
               <w:left w:val="single" w:sz="4" w:space="0" w:color="8C8C8C"/>
@@ -4774,7 +4782,7 @@
         </w:tc>
         <w:tc>
           <w:tcPr>
-            <w:tcW w:type="dxa" w:w="4072"/>
+            <w:tcW w:type="dxa" w:w="4738"/>
             <w:tcBorders>
               <w:top w:val="single" w:sz="4" w:space="0" w:color="8C8C8C"/>
               <w:left w:val="single" w:sz="4" w:space="0" w:color="8C8C8C"/>
@@ -4811,7 +4819,7 @@
       <w:tr>
         <w:tc>
           <w:tcPr>
-            <w:tcW w:type="dxa" w:w="1493"/>
+            <w:tcW w:type="dxa" w:w="1042"/>
             <w:tcBorders>
               <w:top w:val="single" w:sz="4" w:space="0" w:color="8C8C8C"/>
               <w:left w:val="single" w:sz="4" w:space="0" w:color="8C8C8C"/>
@@ -4839,7 +4847,7 @@
         </w:tc>
         <w:tc>
           <w:tcPr>
-            <w:tcW w:type="dxa" w:w="3461"/>
+            <w:tcW w:type="dxa" w:w="3246"/>
             <w:tcBorders>
               <w:top w:val="single" w:sz="4" w:space="0" w:color="8C8C8C"/>
               <w:left w:val="single" w:sz="4" w:space="0" w:color="8C8C8C"/>
@@ -4868,7 +4876,7 @@
         </w:tc>
         <w:tc>
           <w:tcPr>
-            <w:tcW w:type="dxa" w:w="4072"/>
+            <w:tcW w:type="dxa" w:w="4738"/>
             <w:tcBorders>
               <w:top w:val="single" w:sz="4" w:space="0" w:color="8C8C8C"/>
               <w:left w:val="single" w:sz="4" w:space="0" w:color="8C8C8C"/>
@@ -4898,7 +4906,7 @@
       <w:tr>
         <w:tc>
           <w:tcPr>
-            <w:tcW w:type="dxa" w:w="1493"/>
+            <w:tcW w:type="dxa" w:w="1042"/>
             <w:tcBorders>
               <w:top w:val="single" w:sz="4" w:space="0" w:color="8C8C8C"/>
               <w:left w:val="single" w:sz="4" w:space="0" w:color="8C8C8C"/>
@@ -4926,7 +4934,7 @@
         </w:tc>
         <w:tc>
           <w:tcPr>
-            <w:tcW w:type="dxa" w:w="3461"/>
+            <w:tcW w:type="dxa" w:w="3246"/>
             <w:tcBorders>
               <w:top w:val="single" w:sz="4" w:space="0" w:color="8C8C8C"/>
               <w:left w:val="single" w:sz="4" w:space="0" w:color="8C8C8C"/>
@@ -4955,7 +4963,7 @@
         </w:tc>
         <w:tc>
           <w:tcPr>
-            <w:tcW w:type="dxa" w:w="4072"/>
+            <w:tcW w:type="dxa" w:w="4738"/>
             <w:tcBorders>
               <w:top w:val="single" w:sz="4" w:space="0" w:color="8C8C8C"/>
               <w:left w:val="single" w:sz="4" w:space="0" w:color="8C8C8C"/>
@@ -5011,7 +5019,7 @@
       <w:tr>
         <w:tc>
           <w:tcPr>
-            <w:tcW w:type="dxa" w:w="1493"/>
+            <w:tcW w:type="dxa" w:w="1042"/>
             <w:tcBorders>
               <w:top w:val="single" w:sz="4" w:space="0" w:color="8C8C8C"/>
               <w:left w:val="single" w:sz="4" w:space="0" w:color="8C8C8C"/>
@@ -5039,7 +5047,7 @@
         </w:tc>
         <w:tc>
           <w:tcPr>
-            <w:tcW w:type="dxa" w:w="3461"/>
+            <w:tcW w:type="dxa" w:w="3246"/>
             <w:tcBorders>
               <w:top w:val="single" w:sz="4" w:space="0" w:color="8C8C8C"/>
               <w:left w:val="single" w:sz="4" w:space="0" w:color="8C8C8C"/>
@@ -5094,7 +5102,7 @@
         </w:tc>
         <w:tc>
           <w:tcPr>
-            <w:tcW w:type="dxa" w:w="4072"/>
+            <w:tcW w:type="dxa" w:w="4738"/>
             <w:tcBorders>
               <w:top w:val="single" w:sz="4" w:space="0" w:color="8C8C8C"/>
               <w:left w:val="single" w:sz="4" w:space="0" w:color="8C8C8C"/>
@@ -5131,7 +5139,7 @@
       <w:tr>
         <w:tc>
           <w:tcPr>
-            <w:tcW w:type="dxa" w:w="1493"/>
+            <w:tcW w:type="dxa" w:w="1042"/>
             <w:tcBorders>
               <w:top w:val="single" w:sz="4" w:space="0" w:color="8C8C8C"/>
               <w:left w:val="single" w:sz="4" w:space="0" w:color="8C8C8C"/>
@@ -5159,7 +5167,7 @@
         </w:tc>
         <w:tc>
           <w:tcPr>
-            <w:tcW w:type="dxa" w:w="3461"/>
+            <w:tcW w:type="dxa" w:w="3246"/>
             <w:tcBorders>
               <w:top w:val="single" w:sz="4" w:space="0" w:color="8C8C8C"/>
               <w:left w:val="single" w:sz="4" w:space="0" w:color="8C8C8C"/>
@@ -5194,7 +5202,7 @@
         </w:tc>
         <w:tc>
           <w:tcPr>
-            <w:tcW w:type="dxa" w:w="4072"/>
+            <w:tcW w:type="dxa" w:w="4738"/>
             <w:tcBorders>
               <w:top w:val="single" w:sz="4" w:space="0" w:color="8C8C8C"/>
               <w:left w:val="single" w:sz="4" w:space="0" w:color="8C8C8C"/>
@@ -6779,17 +6787,19 @@
       <w:tblPr>
         <w:tblW w:type="auto" w:w="0"/>
         <w:jc w:val="center"/>
+        <w:tblLayout w:type="fixed"/>
         <w:tblLook w:firstColumn="1" w:firstRow="1" w:lastColumn="0" w:lastRow="0" w:noHBand="0" w:noVBand="1" w:val="04A0"/>
+        <w:tblLayout w:type="fixed"/>
       </w:tblPr>
       <w:tblGrid>
-        <w:gridCol w:w="3009"/>
-        <w:gridCol w:w="3009"/>
-        <w:gridCol w:w="3009"/>
+        <w:gridCol w:w="1727"/>
+        <w:gridCol w:w="3649"/>
+        <w:gridCol w:w="3649"/>
       </w:tblGrid>
       <w:tr>
         <w:tc>
           <w:tcPr>
-            <w:tcW w:type="dxa" w:w="1993"/>
+            <w:tcW w:type="dxa" w:w="1727"/>
             <w:tcBorders>
               <w:top w:val="single" w:sz="4" w:space="0" w:color="8C8C8C"/>
               <w:left w:val="single" w:sz="4" w:space="0" w:color="8C8C8C"/>
@@ -6819,7 +6829,7 @@
         </w:tc>
         <w:tc>
           <w:tcPr>
-            <w:tcW w:type="dxa" w:w="3517"/>
+            <w:tcW w:type="dxa" w:w="3649"/>
             <w:tcBorders>
               <w:top w:val="single" w:sz="4" w:space="0" w:color="8C8C8C"/>
               <w:left w:val="single" w:sz="4" w:space="0" w:color="8C8C8C"/>
@@ -6849,7 +6859,7 @@
         </w:tc>
         <w:tc>
           <w:tcPr>
-            <w:tcW w:type="dxa" w:w="3517"/>
+            <w:tcW w:type="dxa" w:w="3649"/>
             <w:tcBorders>
               <w:top w:val="single" w:sz="4" w:space="0" w:color="8C8C8C"/>
               <w:left w:val="single" w:sz="4" w:space="0" w:color="8C8C8C"/>
@@ -6881,7 +6891,7 @@
       <w:tr>
         <w:tc>
           <w:tcPr>
-            <w:tcW w:type="dxa" w:w="1993"/>
+            <w:tcW w:type="dxa" w:w="1727"/>
             <w:tcBorders>
               <w:top w:val="single" w:sz="4" w:space="0" w:color="8C8C8C"/>
               <w:left w:val="single" w:sz="4" w:space="0" w:color="8C8C8C"/>
@@ -6910,7 +6920,7 @@
         </w:tc>
         <w:tc>
           <w:tcPr>
-            <w:tcW w:type="dxa" w:w="3517"/>
+            <w:tcW w:type="dxa" w:w="3649"/>
             <w:tcBorders>
               <w:top w:val="single" w:sz="4" w:space="0" w:color="8C8C8C"/>
               <w:left w:val="single" w:sz="4" w:space="0" w:color="8C8C8C"/>
@@ -6991,7 +7001,7 @@
         </w:tc>
         <w:tc>
           <w:tcPr>
-            <w:tcW w:type="dxa" w:w="3517"/>
+            <w:tcW w:type="dxa" w:w="3649"/>
             <w:tcBorders>
               <w:top w:val="single" w:sz="4" w:space="0" w:color="8C8C8C"/>
               <w:left w:val="single" w:sz="4" w:space="0" w:color="8C8C8C"/>
@@ -7054,7 +7064,7 @@
       <w:tr>
         <w:tc>
           <w:tcPr>
-            <w:tcW w:type="dxa" w:w="1993"/>
+            <w:tcW w:type="dxa" w:w="1727"/>
             <w:tcBorders>
               <w:top w:val="single" w:sz="4" w:space="0" w:color="8C8C8C"/>
               <w:left w:val="single" w:sz="4" w:space="0" w:color="8C8C8C"/>
@@ -7083,7 +7093,7 @@
         </w:tc>
         <w:tc>
           <w:tcPr>
-            <w:tcW w:type="dxa" w:w="3517"/>
+            <w:tcW w:type="dxa" w:w="3649"/>
             <w:tcBorders>
               <w:top w:val="single" w:sz="4" w:space="0" w:color="8C8C8C"/>
               <w:left w:val="single" w:sz="4" w:space="0" w:color="8C8C8C"/>
@@ -7112,7 +7122,7 @@
         </w:tc>
         <w:tc>
           <w:tcPr>
-            <w:tcW w:type="dxa" w:w="3517"/>
+            <w:tcW w:type="dxa" w:w="3649"/>
             <w:tcBorders>
               <w:top w:val="single" w:sz="4" w:space="0" w:color="8C8C8C"/>
               <w:left w:val="single" w:sz="4" w:space="0" w:color="8C8C8C"/>
@@ -7143,7 +7153,7 @@
       <w:tr>
         <w:tc>
           <w:tcPr>
-            <w:tcW w:type="dxa" w:w="1993"/>
+            <w:tcW w:type="dxa" w:w="1727"/>
             <w:tcBorders>
               <w:top w:val="single" w:sz="4" w:space="0" w:color="8C8C8C"/>
               <w:left w:val="single" w:sz="4" w:space="0" w:color="8C8C8C"/>
@@ -7172,7 +7182,7 @@
         </w:tc>
         <w:tc>
           <w:tcPr>
-            <w:tcW w:type="dxa" w:w="3517"/>
+            <w:tcW w:type="dxa" w:w="3649"/>
             <w:tcBorders>
               <w:top w:val="single" w:sz="4" w:space="0" w:color="8C8C8C"/>
               <w:left w:val="single" w:sz="4" w:space="0" w:color="8C8C8C"/>
@@ -7227,7 +7237,7 @@
         </w:tc>
         <w:tc>
           <w:tcPr>
-            <w:tcW w:type="dxa" w:w="3517"/>
+            <w:tcW w:type="dxa" w:w="3649"/>
             <w:tcBorders>
               <w:top w:val="single" w:sz="4" w:space="0" w:color="8C8C8C"/>
               <w:left w:val="single" w:sz="4" w:space="0" w:color="8C8C8C"/>
@@ -7264,7 +7274,7 @@
       <w:tr>
         <w:tc>
           <w:tcPr>
-            <w:tcW w:type="dxa" w:w="1993"/>
+            <w:tcW w:type="dxa" w:w="1727"/>
             <w:tcBorders>
               <w:top w:val="single" w:sz="4" w:space="0" w:color="8C8C8C"/>
               <w:left w:val="single" w:sz="4" w:space="0" w:color="8C8C8C"/>
@@ -7293,7 +7303,7 @@
         </w:tc>
         <w:tc>
           <w:tcPr>
-            <w:tcW w:type="dxa" w:w="3517"/>
+            <w:tcW w:type="dxa" w:w="3649"/>
             <w:tcBorders>
               <w:top w:val="single" w:sz="4" w:space="0" w:color="8C8C8C"/>
               <w:left w:val="single" w:sz="4" w:space="0" w:color="8C8C8C"/>
@@ -7374,7 +7384,7 @@
         </w:tc>
         <w:tc>
           <w:tcPr>
-            <w:tcW w:type="dxa" w:w="3517"/>
+            <w:tcW w:type="dxa" w:w="3649"/>
             <w:tcBorders>
               <w:top w:val="single" w:sz="4" w:space="0" w:color="8C8C8C"/>
               <w:left w:val="single" w:sz="4" w:space="0" w:color="8C8C8C"/>
@@ -7444,7 +7454,7 @@
       <w:tr>
         <w:tc>
           <w:tcPr>
-            <w:tcW w:type="dxa" w:w="1993"/>
+            <w:tcW w:type="dxa" w:w="1727"/>
             <w:tcBorders>
               <w:top w:val="single" w:sz="4" w:space="0" w:color="8C8C8C"/>
               <w:left w:val="single" w:sz="4" w:space="0" w:color="8C8C8C"/>
@@ -7473,7 +7483,7 @@
         </w:tc>
         <w:tc>
           <w:tcPr>
-            <w:tcW w:type="dxa" w:w="3517"/>
+            <w:tcW w:type="dxa" w:w="3649"/>
             <w:tcBorders>
               <w:top w:val="single" w:sz="4" w:space="0" w:color="8C8C8C"/>
               <w:left w:val="single" w:sz="4" w:space="0" w:color="8C8C8C"/>
@@ -7515,7 +7525,7 @@
         </w:tc>
         <w:tc>
           <w:tcPr>
-            <w:tcW w:type="dxa" w:w="3517"/>
+            <w:tcW w:type="dxa" w:w="3649"/>
             <w:tcBorders>
               <w:top w:val="single" w:sz="4" w:space="0" w:color="8C8C8C"/>
               <w:left w:val="single" w:sz="4" w:space="0" w:color="8C8C8C"/>
@@ -7585,7 +7595,7 @@
       <w:tr>
         <w:tc>
           <w:tcPr>
-            <w:tcW w:type="dxa" w:w="1993"/>
+            <w:tcW w:type="dxa" w:w="1727"/>
             <w:tcBorders>
               <w:top w:val="single" w:sz="4" w:space="0" w:color="8C8C8C"/>
               <w:left w:val="single" w:sz="4" w:space="0" w:color="8C8C8C"/>
@@ -7614,7 +7624,7 @@
         </w:tc>
         <w:tc>
           <w:tcPr>
-            <w:tcW w:type="dxa" w:w="3517"/>
+            <w:tcW w:type="dxa" w:w="3649"/>
             <w:tcBorders>
               <w:top w:val="single" w:sz="4" w:space="0" w:color="8C8C8C"/>
               <w:left w:val="single" w:sz="4" w:space="0" w:color="8C8C8C"/>
@@ -7643,7 +7653,7 @@
         </w:tc>
         <w:tc>
           <w:tcPr>
-            <w:tcW w:type="dxa" w:w="3517"/>
+            <w:tcW w:type="dxa" w:w="3649"/>
             <w:tcBorders>
               <w:top w:val="single" w:sz="4" w:space="0" w:color="8C8C8C"/>
               <w:left w:val="single" w:sz="4" w:space="0" w:color="8C8C8C"/>
@@ -8607,18 +8617,20 @@
       <w:tblPr>
         <w:tblW w:type="auto" w:w="0"/>
         <w:jc w:val="center"/>
+        <w:tblLayout w:type="fixed"/>
         <w:tblLook w:firstColumn="1" w:firstRow="1" w:lastColumn="0" w:lastRow="0" w:noHBand="0" w:noVBand="1" w:val="04A0"/>
+        <w:tblLayout w:type="fixed"/>
       </w:tblPr>
       <w:tblGrid>
-        <w:gridCol w:w="2256"/>
-        <w:gridCol w:w="2256"/>
-        <w:gridCol w:w="2256"/>
-        <w:gridCol w:w="2256"/>
+        <w:gridCol w:w="3718"/>
+        <w:gridCol w:w="1607"/>
+        <w:gridCol w:w="1607"/>
+        <w:gridCol w:w="2094"/>
       </w:tblGrid>
       <w:tr>
         <w:tc>
           <w:tcPr>
-            <w:tcW w:type="dxa" w:w="3914"/>
+            <w:tcW w:type="dxa" w:w="3718"/>
             <w:tcBorders>
               <w:top w:val="single" w:sz="4" w:space="0" w:color="8C8C8C"/>
               <w:left w:val="single" w:sz="4" w:space="0" w:color="8C8C8C"/>
@@ -8648,7 +8660,7 @@
         </w:tc>
         <w:tc>
           <w:tcPr>
-            <w:tcW w:type="dxa" w:w="2237"/>
+            <w:tcW w:type="dxa" w:w="1607"/>
             <w:tcBorders>
               <w:top w:val="single" w:sz="4" w:space="0" w:color="8C8C8C"/>
               <w:left w:val="single" w:sz="4" w:space="0" w:color="8C8C8C"/>
@@ -8678,7 +8690,7 @@
         </w:tc>
         <w:tc>
           <w:tcPr>
-            <w:tcW w:type="dxa" w:w="879"/>
+            <w:tcW w:type="dxa" w:w="1607"/>
             <w:tcBorders>
               <w:top w:val="single" w:sz="4" w:space="0" w:color="8C8C8C"/>
               <w:left w:val="single" w:sz="4" w:space="0" w:color="8C8C8C"/>
@@ -8708,7 +8720,7 @@
         </w:tc>
         <w:tc>
           <w:tcPr>
-            <w:tcW w:type="dxa" w:w="1997"/>
+            <w:tcW w:type="dxa" w:w="2094"/>
             <w:tcBorders>
               <w:top w:val="single" w:sz="4" w:space="0" w:color="8C8C8C"/>
               <w:left w:val="single" w:sz="4" w:space="0" w:color="8C8C8C"/>
@@ -8740,7 +8752,7 @@
       <w:tr>
         <w:tc>
           <w:tcPr>
-            <w:tcW w:type="dxa" w:w="3914"/>
+            <w:tcW w:type="dxa" w:w="3718"/>
             <w:tcBorders>
               <w:top w:val="single" w:sz="4" w:space="0" w:color="8C8C8C"/>
               <w:left w:val="single" w:sz="4" w:space="0" w:color="8C8C8C"/>
@@ -8769,7 +8781,7 @@
         </w:tc>
         <w:tc>
           <w:tcPr>
-            <w:tcW w:type="dxa" w:w="2237"/>
+            <w:tcW w:type="dxa" w:w="1607"/>
             <w:tcBorders>
               <w:top w:val="single" w:sz="4" w:space="0" w:color="8C8C8C"/>
               <w:left w:val="single" w:sz="4" w:space="0" w:color="8C8C8C"/>
@@ -8797,7 +8809,7 @@
         </w:tc>
         <w:tc>
           <w:tcPr>
-            <w:tcW w:type="dxa" w:w="879"/>
+            <w:tcW w:type="dxa" w:w="1607"/>
             <w:tcBorders>
               <w:top w:val="single" w:sz="4" w:space="0" w:color="8C8C8C"/>
               <w:left w:val="single" w:sz="4" w:space="0" w:color="8C8C8C"/>
@@ -8825,7 +8837,7 @@
         </w:tc>
         <w:tc>
           <w:tcPr>
-            <w:tcW w:type="dxa" w:w="1997"/>
+            <w:tcW w:type="dxa" w:w="2094"/>
             <w:tcBorders>
               <w:top w:val="single" w:sz="4" w:space="0" w:color="8C8C8C"/>
               <w:left w:val="single" w:sz="4" w:space="0" w:color="8C8C8C"/>
@@ -8856,7 +8868,7 @@
       <w:tr>
         <w:tc>
           <w:tcPr>
-            <w:tcW w:type="dxa" w:w="3914"/>
+            <w:tcW w:type="dxa" w:w="3718"/>
             <w:tcBorders>
               <w:top w:val="single" w:sz="4" w:space="0" w:color="8C8C8C"/>
               <w:left w:val="single" w:sz="4" w:space="0" w:color="8C8C8C"/>
@@ -8885,7 +8897,7 @@
         </w:tc>
         <w:tc>
           <w:tcPr>
-            <w:tcW w:type="dxa" w:w="2237"/>
+            <w:tcW w:type="dxa" w:w="1607"/>
             <w:tcBorders>
               <w:top w:val="single" w:sz="4" w:space="0" w:color="8C8C8C"/>
               <w:left w:val="single" w:sz="4" w:space="0" w:color="8C8C8C"/>
@@ -8913,7 +8925,7 @@
         </w:tc>
         <w:tc>
           <w:tcPr>
-            <w:tcW w:type="dxa" w:w="879"/>
+            <w:tcW w:type="dxa" w:w="1607"/>
             <w:tcBorders>
               <w:top w:val="single" w:sz="4" w:space="0" w:color="8C8C8C"/>
               <w:left w:val="single" w:sz="4" w:space="0" w:color="8C8C8C"/>
@@ -8941,7 +8953,7 @@
         </w:tc>
         <w:tc>
           <w:tcPr>
-            <w:tcW w:type="dxa" w:w="1997"/>
+            <w:tcW w:type="dxa" w:w="2094"/>
             <w:tcBorders>
               <w:top w:val="single" w:sz="4" w:space="0" w:color="8C8C8C"/>
               <w:left w:val="single" w:sz="4" w:space="0" w:color="8C8C8C"/>
@@ -8972,7 +8984,7 @@
       <w:tr>
         <w:tc>
           <w:tcPr>
-            <w:tcW w:type="dxa" w:w="3914"/>
+            <w:tcW w:type="dxa" w:w="3718"/>
             <w:tcBorders>
               <w:top w:val="single" w:sz="4" w:space="0" w:color="8C8C8C"/>
               <w:left w:val="single" w:sz="4" w:space="0" w:color="8C8C8C"/>
@@ -9001,7 +9013,7 @@
         </w:tc>
         <w:tc>
           <w:tcPr>
-            <w:tcW w:type="dxa" w:w="2237"/>
+            <w:tcW w:type="dxa" w:w="1607"/>
             <w:tcBorders>
               <w:top w:val="single" w:sz="4" w:space="0" w:color="8C8C8C"/>
               <w:left w:val="single" w:sz="4" w:space="0" w:color="8C8C8C"/>
@@ -9029,7 +9041,7 @@
         </w:tc>
         <w:tc>
           <w:tcPr>
-            <w:tcW w:type="dxa" w:w="879"/>
+            <w:tcW w:type="dxa" w:w="1607"/>
             <w:tcBorders>
               <w:top w:val="single" w:sz="4" w:space="0" w:color="8C8C8C"/>
               <w:left w:val="single" w:sz="4" w:space="0" w:color="8C8C8C"/>
@@ -9057,7 +9069,7 @@
         </w:tc>
         <w:tc>
           <w:tcPr>
-            <w:tcW w:type="dxa" w:w="1997"/>
+            <w:tcW w:type="dxa" w:w="2094"/>
             <w:tcBorders>
               <w:top w:val="single" w:sz="4" w:space="0" w:color="8C8C8C"/>
               <w:left w:val="single" w:sz="4" w:space="0" w:color="8C8C8C"/>
@@ -9088,7 +9100,7 @@
       <w:tr>
         <w:tc>
           <w:tcPr>
-            <w:tcW w:type="dxa" w:w="3914"/>
+            <w:tcW w:type="dxa" w:w="3718"/>
             <w:tcBorders>
               <w:top w:val="single" w:sz="4" w:space="0" w:color="8C8C8C"/>
               <w:left w:val="single" w:sz="4" w:space="0" w:color="8C8C8C"/>
@@ -9117,7 +9129,7 @@
         </w:tc>
         <w:tc>
           <w:tcPr>
-            <w:tcW w:type="dxa" w:w="2237"/>
+            <w:tcW w:type="dxa" w:w="1607"/>
             <w:tcBorders>
               <w:top w:val="single" w:sz="4" w:space="0" w:color="8C8C8C"/>
               <w:left w:val="single" w:sz="4" w:space="0" w:color="8C8C8C"/>
@@ -9145,7 +9157,7 @@
         </w:tc>
         <w:tc>
           <w:tcPr>
-            <w:tcW w:type="dxa" w:w="879"/>
+            <w:tcW w:type="dxa" w:w="1607"/>
             <w:tcBorders>
               <w:top w:val="single" w:sz="4" w:space="0" w:color="8C8C8C"/>
               <w:left w:val="single" w:sz="4" w:space="0" w:color="8C8C8C"/>
@@ -9173,7 +9185,7 @@
         </w:tc>
         <w:tc>
           <w:tcPr>
-            <w:tcW w:type="dxa" w:w="1997"/>
+            <w:tcW w:type="dxa" w:w="2094"/>
             <w:tcBorders>
               <w:top w:val="single" w:sz="4" w:space="0" w:color="8C8C8C"/>
               <w:left w:val="single" w:sz="4" w:space="0" w:color="8C8C8C"/>
@@ -9204,7 +9216,7 @@
       <w:tr>
         <w:tc>
           <w:tcPr>
-            <w:tcW w:type="dxa" w:w="3914"/>
+            <w:tcW w:type="dxa" w:w="3718"/>
             <w:tcBorders>
               <w:top w:val="single" w:sz="4" w:space="0" w:color="8C8C8C"/>
               <w:left w:val="single" w:sz="4" w:space="0" w:color="8C8C8C"/>
@@ -9233,7 +9245,7 @@
         </w:tc>
         <w:tc>
           <w:tcPr>
-            <w:tcW w:type="dxa" w:w="2237"/>
+            <w:tcW w:type="dxa" w:w="1607"/>
             <w:tcBorders>
               <w:top w:val="single" w:sz="4" w:space="0" w:color="8C8C8C"/>
               <w:left w:val="single" w:sz="4" w:space="0" w:color="8C8C8C"/>
@@ -9261,7 +9273,7 @@
         </w:tc>
         <w:tc>
           <w:tcPr>
-            <w:tcW w:type="dxa" w:w="879"/>
+            <w:tcW w:type="dxa" w:w="1607"/>
             <w:tcBorders>
               <w:top w:val="single" w:sz="4" w:space="0" w:color="8C8C8C"/>
               <w:left w:val="single" w:sz="4" w:space="0" w:color="8C8C8C"/>
@@ -9289,7 +9301,7 @@
         </w:tc>
         <w:tc>
           <w:tcPr>
-            <w:tcW w:type="dxa" w:w="1997"/>
+            <w:tcW w:type="dxa" w:w="2094"/>
             <w:tcBorders>
               <w:top w:val="single" w:sz="4" w:space="0" w:color="8C8C8C"/>
               <w:left w:val="single" w:sz="4" w:space="0" w:color="8C8C8C"/>
@@ -9320,7 +9332,7 @@
       <w:tr>
         <w:tc>
           <w:tcPr>
-            <w:tcW w:type="dxa" w:w="3914"/>
+            <w:tcW w:type="dxa" w:w="3718"/>
             <w:tcBorders>
               <w:top w:val="single" w:sz="4" w:space="0" w:color="8C8C8C"/>
               <w:left w:val="single" w:sz="4" w:space="0" w:color="8C8C8C"/>
@@ -9349,7 +9361,7 @@
         </w:tc>
         <w:tc>
           <w:tcPr>
-            <w:tcW w:type="dxa" w:w="2237"/>
+            <w:tcW w:type="dxa" w:w="1607"/>
             <w:tcBorders>
               <w:top w:val="single" w:sz="4" w:space="0" w:color="8C8C8C"/>
               <w:left w:val="single" w:sz="4" w:space="0" w:color="8C8C8C"/>
@@ -9377,7 +9389,7 @@
         </w:tc>
         <w:tc>
           <w:tcPr>
-            <w:tcW w:type="dxa" w:w="879"/>
+            <w:tcW w:type="dxa" w:w="1607"/>
             <w:tcBorders>
               <w:top w:val="single" w:sz="4" w:space="0" w:color="8C8C8C"/>
               <w:left w:val="single" w:sz="4" w:space="0" w:color="8C8C8C"/>
@@ -9405,7 +9417,7 @@
         </w:tc>
         <w:tc>
           <w:tcPr>
-            <w:tcW w:type="dxa" w:w="1997"/>
+            <w:tcW w:type="dxa" w:w="2094"/>
             <w:tcBorders>
               <w:top w:val="single" w:sz="4" w:space="0" w:color="8C8C8C"/>
               <w:left w:val="single" w:sz="4" w:space="0" w:color="8C8C8C"/>
@@ -9436,7 +9448,7 @@
       <w:tr>
         <w:tc>
           <w:tcPr>
-            <w:tcW w:type="dxa" w:w="3914"/>
+            <w:tcW w:type="dxa" w:w="3718"/>
             <w:tcBorders>
               <w:top w:val="single" w:sz="4" w:space="0" w:color="8C8C8C"/>
               <w:left w:val="single" w:sz="4" w:space="0" w:color="8C8C8C"/>
@@ -9465,7 +9477,7 @@
         </w:tc>
         <w:tc>
           <w:tcPr>
-            <w:tcW w:type="dxa" w:w="2237"/>
+            <w:tcW w:type="dxa" w:w="1607"/>
             <w:tcBorders>
               <w:top w:val="single" w:sz="4" w:space="0" w:color="8C8C8C"/>
               <w:left w:val="single" w:sz="4" w:space="0" w:color="8C8C8C"/>
@@ -9493,7 +9505,7 @@
         </w:tc>
         <w:tc>
           <w:tcPr>
-            <w:tcW w:type="dxa" w:w="879"/>
+            <w:tcW w:type="dxa" w:w="1607"/>
             <w:tcBorders>
               <w:top w:val="single" w:sz="4" w:space="0" w:color="8C8C8C"/>
               <w:left w:val="single" w:sz="4" w:space="0" w:color="8C8C8C"/>
@@ -9521,7 +9533,7 @@
         </w:tc>
         <w:tc>
           <w:tcPr>
-            <w:tcW w:type="dxa" w:w="1997"/>
+            <w:tcW w:type="dxa" w:w="2094"/>
             <w:tcBorders>
               <w:top w:val="single" w:sz="4" w:space="0" w:color="8C8C8C"/>
               <w:left w:val="single" w:sz="4" w:space="0" w:color="8C8C8C"/>
@@ -9552,7 +9564,7 @@
       <w:tr>
         <w:tc>
           <w:tcPr>
-            <w:tcW w:type="dxa" w:w="3914"/>
+            <w:tcW w:type="dxa" w:w="3718"/>
             <w:tcBorders>
               <w:top w:val="single" w:sz="4" w:space="0" w:color="8C8C8C"/>
               <w:left w:val="single" w:sz="4" w:space="0" w:color="8C8C8C"/>
@@ -9581,7 +9593,7 @@
         </w:tc>
         <w:tc>
           <w:tcPr>
-            <w:tcW w:type="dxa" w:w="2237"/>
+            <w:tcW w:type="dxa" w:w="1607"/>
             <w:tcBorders>
               <w:top w:val="single" w:sz="4" w:space="0" w:color="8C8C8C"/>
               <w:left w:val="single" w:sz="4" w:space="0" w:color="8C8C8C"/>
@@ -9609,7 +9621,7 @@
         </w:tc>
         <w:tc>
           <w:tcPr>
-            <w:tcW w:type="dxa" w:w="879"/>
+            <w:tcW w:type="dxa" w:w="1607"/>
             <w:tcBorders>
               <w:top w:val="single" w:sz="4" w:space="0" w:color="8C8C8C"/>
               <w:left w:val="single" w:sz="4" w:space="0" w:color="8C8C8C"/>
@@ -9637,7 +9649,7 @@
         </w:tc>
         <w:tc>
           <w:tcPr>
-            <w:tcW w:type="dxa" w:w="1997"/>
+            <w:tcW w:type="dxa" w:w="2094"/>
             <w:tcBorders>
               <w:top w:val="single" w:sz="4" w:space="0" w:color="8C8C8C"/>
               <w:left w:val="single" w:sz="4" w:space="0" w:color="8C8C8C"/>
@@ -9668,7 +9680,7 @@
       <w:tr>
         <w:tc>
           <w:tcPr>
-            <w:tcW w:type="dxa" w:w="3914"/>
+            <w:tcW w:type="dxa" w:w="3718"/>
             <w:tcBorders>
               <w:top w:val="single" w:sz="4" w:space="0" w:color="8C8C8C"/>
               <w:left w:val="single" w:sz="4" w:space="0" w:color="8C8C8C"/>
@@ -9697,7 +9709,7 @@
         </w:tc>
         <w:tc>
           <w:tcPr>
-            <w:tcW w:type="dxa" w:w="2237"/>
+            <w:tcW w:type="dxa" w:w="1607"/>
             <w:tcBorders>
               <w:top w:val="single" w:sz="4" w:space="0" w:color="8C8C8C"/>
               <w:left w:val="single" w:sz="4" w:space="0" w:color="8C8C8C"/>
@@ -9725,7 +9737,7 @@
         </w:tc>
         <w:tc>
           <w:tcPr>
-            <w:tcW w:type="dxa" w:w="879"/>
+            <w:tcW w:type="dxa" w:w="1607"/>
             <w:tcBorders>
               <w:top w:val="single" w:sz="4" w:space="0" w:color="8C8C8C"/>
               <w:left w:val="single" w:sz="4" w:space="0" w:color="8C8C8C"/>
@@ -9753,7 +9765,7 @@
         </w:tc>
         <w:tc>
           <w:tcPr>
-            <w:tcW w:type="dxa" w:w="1997"/>
+            <w:tcW w:type="dxa" w:w="2094"/>
             <w:tcBorders>
               <w:top w:val="single" w:sz="4" w:space="0" w:color="8C8C8C"/>
               <w:left w:val="single" w:sz="4" w:space="0" w:color="8C8C8C"/>
@@ -9834,16 +9846,18 @@
       <w:tblPr>
         <w:tblW w:type="auto" w:w="0"/>
         <w:jc w:val="center"/>
+        <w:tblLayout w:type="fixed"/>
         <w:tblLook w:firstColumn="1" w:firstRow="1" w:lastColumn="0" w:lastRow="0" w:noHBand="0" w:noVBand="1" w:val="04A0"/>
+        <w:tblLayout w:type="fixed"/>
       </w:tblPr>
       <w:tblGrid>
-        <w:gridCol w:w="4513"/>
-        <w:gridCol w:w="4513"/>
+        <w:gridCol w:w="5798"/>
+        <w:gridCol w:w="3228"/>
       </w:tblGrid>
       <w:tr>
         <w:tc>
           <w:tcPr>
-            <w:tcW w:type="dxa" w:w="4772"/>
+            <w:tcW w:type="dxa" w:w="5798"/>
             <w:tcBorders>
               <w:top w:val="single" w:sz="4" w:space="0" w:color="8C8C8C"/>
               <w:left w:val="single" w:sz="4" w:space="0" w:color="8C8C8C"/>
@@ -9873,7 +9887,7 @@
         </w:tc>
         <w:tc>
           <w:tcPr>
-            <w:tcW w:type="dxa" w:w="4254"/>
+            <w:tcW w:type="dxa" w:w="3228"/>
             <w:tcBorders>
               <w:top w:val="single" w:sz="4" w:space="0" w:color="8C8C8C"/>
               <w:left w:val="single" w:sz="4" w:space="0" w:color="8C8C8C"/>
@@ -9905,7 +9919,7 @@
       <w:tr>
         <w:tc>
           <w:tcPr>
-            <w:tcW w:type="dxa" w:w="4772"/>
+            <w:tcW w:type="dxa" w:w="5798"/>
             <w:tcBorders>
               <w:top w:val="single" w:sz="4" w:space="0" w:color="8C8C8C"/>
               <w:left w:val="single" w:sz="4" w:space="0" w:color="8C8C8C"/>
@@ -9934,7 +9948,7 @@
         </w:tc>
         <w:tc>
           <w:tcPr>
-            <w:tcW w:type="dxa" w:w="4254"/>
+            <w:tcW w:type="dxa" w:w="3228"/>
             <w:tcBorders>
               <w:top w:val="single" w:sz="4" w:space="0" w:color="8C8C8C"/>
               <w:left w:val="single" w:sz="4" w:space="0" w:color="8C8C8C"/>
@@ -9964,7 +9978,7 @@
       <w:tr>
         <w:tc>
           <w:tcPr>
-            <w:tcW w:type="dxa" w:w="4772"/>
+            <w:tcW w:type="dxa" w:w="5798"/>
             <w:tcBorders>
               <w:top w:val="single" w:sz="4" w:space="0" w:color="8C8C8C"/>
               <w:left w:val="single" w:sz="4" w:space="0" w:color="8C8C8C"/>
@@ -9993,7 +10007,7 @@
         </w:tc>
         <w:tc>
           <w:tcPr>
-            <w:tcW w:type="dxa" w:w="4254"/>
+            <w:tcW w:type="dxa" w:w="3228"/>
             <w:tcBorders>
               <w:top w:val="single" w:sz="4" w:space="0" w:color="8C8C8C"/>
               <w:left w:val="single" w:sz="4" w:space="0" w:color="8C8C8C"/>
@@ -10023,7 +10037,7 @@
       <w:tr>
         <w:tc>
           <w:tcPr>
-            <w:tcW w:type="dxa" w:w="4772"/>
+            <w:tcW w:type="dxa" w:w="5798"/>
             <w:tcBorders>
               <w:top w:val="single" w:sz="4" w:space="0" w:color="8C8C8C"/>
               <w:left w:val="single" w:sz="4" w:space="0" w:color="8C8C8C"/>
@@ -10052,7 +10066,7 @@
         </w:tc>
         <w:tc>
           <w:tcPr>
-            <w:tcW w:type="dxa" w:w="4254"/>
+            <w:tcW w:type="dxa" w:w="3228"/>
             <w:tcBorders>
               <w:top w:val="single" w:sz="4" w:space="0" w:color="8C8C8C"/>
               <w:left w:val="single" w:sz="4" w:space="0" w:color="8C8C8C"/>
@@ -10082,7 +10096,7 @@
       <w:tr>
         <w:tc>
           <w:tcPr>
-            <w:tcW w:type="dxa" w:w="4772"/>
+            <w:tcW w:type="dxa" w:w="5798"/>
             <w:tcBorders>
               <w:top w:val="single" w:sz="4" w:space="0" w:color="8C8C8C"/>
               <w:left w:val="single" w:sz="4" w:space="0" w:color="8C8C8C"/>
@@ -10111,7 +10125,7 @@
         </w:tc>
         <w:tc>
           <w:tcPr>
-            <w:tcW w:type="dxa" w:w="4254"/>
+            <w:tcW w:type="dxa" w:w="3228"/>
             <w:tcBorders>
               <w:top w:val="single" w:sz="4" w:space="0" w:color="8C8C8C"/>
               <w:left w:val="single" w:sz="4" w:space="0" w:color="8C8C8C"/>
@@ -10141,7 +10155,7 @@
       <w:tr>
         <w:tc>
           <w:tcPr>
-            <w:tcW w:type="dxa" w:w="4772"/>
+            <w:tcW w:type="dxa" w:w="5798"/>
             <w:tcBorders>
               <w:top w:val="single" w:sz="4" w:space="0" w:color="8C8C8C"/>
               <w:left w:val="single" w:sz="4" w:space="0" w:color="8C8C8C"/>
@@ -10170,7 +10184,7 @@
         </w:tc>
         <w:tc>
           <w:tcPr>
-            <w:tcW w:type="dxa" w:w="4254"/>
+            <w:tcW w:type="dxa" w:w="3228"/>
             <w:tcBorders>
               <w:top w:val="single" w:sz="4" w:space="0" w:color="8C8C8C"/>
               <w:left w:val="single" w:sz="4" w:space="0" w:color="8C8C8C"/>
@@ -10911,18 +10925,20 @@
       <w:tblPr>
         <w:tblW w:type="auto" w:w="0"/>
         <w:jc w:val="center"/>
+        <w:tblLayout w:type="fixed"/>
         <w:tblLook w:firstColumn="1" w:firstRow="1" w:lastColumn="0" w:lastRow="0" w:noHBand="0" w:noVBand="1" w:val="04A0"/>
+        <w:tblLayout w:type="fixed"/>
       </w:tblPr>
       <w:tblGrid>
-        <w:gridCol w:w="2256"/>
-        <w:gridCol w:w="2256"/>
-        <w:gridCol w:w="2256"/>
-        <w:gridCol w:w="2256"/>
+        <w:gridCol w:w="1106"/>
+        <w:gridCol w:w="5028"/>
+        <w:gridCol w:w="1571"/>
+        <w:gridCol w:w="1320"/>
       </w:tblGrid>
       <w:tr>
         <w:tc>
           <w:tcPr>
-            <w:tcW w:type="dxa" w:w="1167"/>
+            <w:tcW w:type="dxa" w:w="1106"/>
             <w:tcBorders>
               <w:top w:val="single" w:sz="4" w:space="0" w:color="8C8C8C"/>
               <w:left w:val="single" w:sz="4" w:space="0" w:color="8C8C8C"/>
@@ -10952,7 +10968,7 @@
         </w:tc>
         <w:tc>
           <w:tcPr>
-            <w:tcW w:type="dxa" w:w="4669"/>
+            <w:tcW w:type="dxa" w:w="5028"/>
             <w:tcBorders>
               <w:top w:val="single" w:sz="4" w:space="0" w:color="8C8C8C"/>
               <w:left w:val="single" w:sz="4" w:space="0" w:color="8C8C8C"/>
@@ -10982,7 +10998,7 @@
         </w:tc>
         <w:tc>
           <w:tcPr>
-            <w:tcW w:type="dxa" w:w="1323"/>
+            <w:tcW w:type="dxa" w:w="1571"/>
             <w:tcBorders>
               <w:top w:val="single" w:sz="4" w:space="0" w:color="8C8C8C"/>
               <w:left w:val="single" w:sz="4" w:space="0" w:color="8C8C8C"/>
@@ -11012,7 +11028,7 @@
         </w:tc>
         <w:tc>
           <w:tcPr>
-            <w:tcW w:type="dxa" w:w="1867"/>
+            <w:tcW w:type="dxa" w:w="1320"/>
             <w:tcBorders>
               <w:top w:val="single" w:sz="4" w:space="0" w:color="8C8C8C"/>
               <w:left w:val="single" w:sz="4" w:space="0" w:color="8C8C8C"/>
@@ -11044,7 +11060,7 @@
       <w:tr>
         <w:tc>
           <w:tcPr>
-            <w:tcW w:type="dxa" w:w="1167"/>
+            <w:tcW w:type="dxa" w:w="1106"/>
             <w:tcBorders>
               <w:top w:val="single" w:sz="4" w:space="0" w:color="8C8C8C"/>
               <w:left w:val="single" w:sz="4" w:space="0" w:color="8C8C8C"/>
@@ -11072,7 +11088,7 @@
         </w:tc>
         <w:tc>
           <w:tcPr>
-            <w:tcW w:type="dxa" w:w="4669"/>
+            <w:tcW w:type="dxa" w:w="5028"/>
             <w:tcBorders>
               <w:top w:val="single" w:sz="4" w:space="0" w:color="8C8C8C"/>
               <w:left w:val="single" w:sz="4" w:space="0" w:color="8C8C8C"/>
@@ -11100,7 +11116,7 @@
         </w:tc>
         <w:tc>
           <w:tcPr>
-            <w:tcW w:type="dxa" w:w="1323"/>
+            <w:tcW w:type="dxa" w:w="1571"/>
             <w:tcBorders>
               <w:top w:val="single" w:sz="4" w:space="0" w:color="8C8C8C"/>
               <w:left w:val="single" w:sz="4" w:space="0" w:color="8C8C8C"/>
@@ -11129,7 +11145,7 @@
         </w:tc>
         <w:tc>
           <w:tcPr>
-            <w:tcW w:type="dxa" w:w="1867"/>
+            <w:tcW w:type="dxa" w:w="1320"/>
             <w:tcBorders>
               <w:top w:val="single" w:sz="4" w:space="0" w:color="8C8C8C"/>
               <w:left w:val="single" w:sz="4" w:space="0" w:color="8C8C8C"/>
@@ -11159,7 +11175,7 @@
       <w:tr>
         <w:tc>
           <w:tcPr>
-            <w:tcW w:type="dxa" w:w="1167"/>
+            <w:tcW w:type="dxa" w:w="1106"/>
             <w:tcBorders>
               <w:top w:val="single" w:sz="4" w:space="0" w:color="8C8C8C"/>
               <w:left w:val="single" w:sz="4" w:space="0" w:color="8C8C8C"/>
@@ -11187,7 +11203,7 @@
         </w:tc>
         <w:tc>
           <w:tcPr>
-            <w:tcW w:type="dxa" w:w="4669"/>
+            <w:tcW w:type="dxa" w:w="5028"/>
             <w:tcBorders>
               <w:top w:val="single" w:sz="4" w:space="0" w:color="8C8C8C"/>
               <w:left w:val="single" w:sz="4" w:space="0" w:color="8C8C8C"/>
@@ -11215,7 +11231,7 @@
         </w:tc>
         <w:tc>
           <w:tcPr>
-            <w:tcW w:type="dxa" w:w="1323"/>
+            <w:tcW w:type="dxa" w:w="1571"/>
             <w:tcBorders>
               <w:top w:val="single" w:sz="4" w:space="0" w:color="8C8C8C"/>
               <w:left w:val="single" w:sz="4" w:space="0" w:color="8C8C8C"/>
@@ -11244,7 +11260,7 @@
         </w:tc>
         <w:tc>
           <w:tcPr>
-            <w:tcW w:type="dxa" w:w="1867"/>
+            <w:tcW w:type="dxa" w:w="1320"/>
             <w:tcBorders>
               <w:top w:val="single" w:sz="4" w:space="0" w:color="8C8C8C"/>
               <w:left w:val="single" w:sz="4" w:space="0" w:color="8C8C8C"/>
@@ -11274,7 +11290,7 @@
       <w:tr>
         <w:tc>
           <w:tcPr>
-            <w:tcW w:type="dxa" w:w="1167"/>
+            <w:tcW w:type="dxa" w:w="1106"/>
             <w:tcBorders>
               <w:top w:val="single" w:sz="4" w:space="0" w:color="8C8C8C"/>
               <w:left w:val="single" w:sz="4" w:space="0" w:color="8C8C8C"/>
@@ -11302,7 +11318,7 @@
         </w:tc>
         <w:tc>
           <w:tcPr>
-            <w:tcW w:type="dxa" w:w="4669"/>
+            <w:tcW w:type="dxa" w:w="5028"/>
             <w:tcBorders>
               <w:top w:val="single" w:sz="4" w:space="0" w:color="8C8C8C"/>
               <w:left w:val="single" w:sz="4" w:space="0" w:color="8C8C8C"/>
@@ -11330,7 +11346,7 @@
         </w:tc>
         <w:tc>
           <w:tcPr>
-            <w:tcW w:type="dxa" w:w="1323"/>
+            <w:tcW w:type="dxa" w:w="1571"/>
             <w:tcBorders>
               <w:top w:val="single" w:sz="4" w:space="0" w:color="8C8C8C"/>
               <w:left w:val="single" w:sz="4" w:space="0" w:color="8C8C8C"/>
@@ -11359,7 +11375,7 @@
         </w:tc>
         <w:tc>
           <w:tcPr>
-            <w:tcW w:type="dxa" w:w="1867"/>
+            <w:tcW w:type="dxa" w:w="1320"/>
             <w:tcBorders>
               <w:top w:val="single" w:sz="4" w:space="0" w:color="8C8C8C"/>
               <w:left w:val="single" w:sz="4" w:space="0" w:color="8C8C8C"/>
@@ -11389,7 +11405,7 @@
       <w:tr>
         <w:tc>
           <w:tcPr>
-            <w:tcW w:type="dxa" w:w="1167"/>
+            <w:tcW w:type="dxa" w:w="1106"/>
             <w:tcBorders>
               <w:top w:val="single" w:sz="4" w:space="0" w:color="8C8C8C"/>
               <w:left w:val="single" w:sz="4" w:space="0" w:color="8C8C8C"/>
@@ -11417,7 +11433,7 @@
         </w:tc>
         <w:tc>
           <w:tcPr>
-            <w:tcW w:type="dxa" w:w="4669"/>
+            <w:tcW w:type="dxa" w:w="5028"/>
             <w:tcBorders>
               <w:top w:val="single" w:sz="4" w:space="0" w:color="8C8C8C"/>
               <w:left w:val="single" w:sz="4" w:space="0" w:color="8C8C8C"/>
@@ -11445,7 +11461,7 @@
         </w:tc>
         <w:tc>
           <w:tcPr>
-            <w:tcW w:type="dxa" w:w="1323"/>
+            <w:tcW w:type="dxa" w:w="1571"/>
             <w:tcBorders>
               <w:top w:val="single" w:sz="4" w:space="0" w:color="8C8C8C"/>
               <w:left w:val="single" w:sz="4" w:space="0" w:color="8C8C8C"/>
@@ -11474,7 +11490,7 @@
         </w:tc>
         <w:tc>
           <w:tcPr>
-            <w:tcW w:type="dxa" w:w="1867"/>
+            <w:tcW w:type="dxa" w:w="1320"/>
             <w:tcBorders>
               <w:top w:val="single" w:sz="4" w:space="0" w:color="8C8C8C"/>
               <w:left w:val="single" w:sz="4" w:space="0" w:color="8C8C8C"/>
@@ -11504,7 +11520,7 @@
       <w:tr>
         <w:tc>
           <w:tcPr>
-            <w:tcW w:type="dxa" w:w="1167"/>
+            <w:tcW w:type="dxa" w:w="1106"/>
             <w:tcBorders>
               <w:top w:val="single" w:sz="4" w:space="0" w:color="8C8C8C"/>
               <w:left w:val="single" w:sz="4" w:space="0" w:color="8C8C8C"/>
@@ -11532,7 +11548,7 @@
         </w:tc>
         <w:tc>
           <w:tcPr>
-            <w:tcW w:type="dxa" w:w="4669"/>
+            <w:tcW w:type="dxa" w:w="5028"/>
             <w:tcBorders>
               <w:top w:val="single" w:sz="4" w:space="0" w:color="8C8C8C"/>
               <w:left w:val="single" w:sz="4" w:space="0" w:color="8C8C8C"/>
@@ -11560,7 +11576,7 @@
         </w:tc>
         <w:tc>
           <w:tcPr>
-            <w:tcW w:type="dxa" w:w="1323"/>
+            <w:tcW w:type="dxa" w:w="1571"/>
             <w:tcBorders>
               <w:top w:val="single" w:sz="4" w:space="0" w:color="8C8C8C"/>
               <w:left w:val="single" w:sz="4" w:space="0" w:color="8C8C8C"/>
@@ -11589,7 +11605,7 @@
         </w:tc>
         <w:tc>
           <w:tcPr>
-            <w:tcW w:type="dxa" w:w="1867"/>
+            <w:tcW w:type="dxa" w:w="1320"/>
             <w:tcBorders>
               <w:top w:val="single" w:sz="4" w:space="0" w:color="8C8C8C"/>
               <w:left w:val="single" w:sz="4" w:space="0" w:color="8C8C8C"/>
@@ -11619,7 +11635,7 @@
       <w:tr>
         <w:tc>
           <w:tcPr>
-            <w:tcW w:type="dxa" w:w="1167"/>
+            <w:tcW w:type="dxa" w:w="1106"/>
             <w:tcBorders>
               <w:top w:val="single" w:sz="4" w:space="0" w:color="8C8C8C"/>
               <w:left w:val="single" w:sz="4" w:space="0" w:color="8C8C8C"/>
@@ -11647,7 +11663,7 @@
         </w:tc>
         <w:tc>
           <w:tcPr>
-            <w:tcW w:type="dxa" w:w="4669"/>
+            <w:tcW w:type="dxa" w:w="5028"/>
             <w:tcBorders>
               <w:top w:val="single" w:sz="4" w:space="0" w:color="8C8C8C"/>
               <w:left w:val="single" w:sz="4" w:space="0" w:color="8C8C8C"/>
@@ -11675,7 +11691,7 @@
         </w:tc>
         <w:tc>
           <w:tcPr>
-            <w:tcW w:type="dxa" w:w="1323"/>
+            <w:tcW w:type="dxa" w:w="1571"/>
             <w:tcBorders>
               <w:top w:val="single" w:sz="4" w:space="0" w:color="8C8C8C"/>
               <w:left w:val="single" w:sz="4" w:space="0" w:color="8C8C8C"/>
@@ -11704,7 +11720,7 @@
         </w:tc>
         <w:tc>
           <w:tcPr>
-            <w:tcW w:type="dxa" w:w="1867"/>
+            <w:tcW w:type="dxa" w:w="1320"/>
             <w:tcBorders>
               <w:top w:val="single" w:sz="4" w:space="0" w:color="8C8C8C"/>
               <w:left w:val="single" w:sz="4" w:space="0" w:color="8C8C8C"/>
@@ -11734,7 +11750,7 @@
       <w:tr>
         <w:tc>
           <w:tcPr>
-            <w:tcW w:type="dxa" w:w="1167"/>
+            <w:tcW w:type="dxa" w:w="1106"/>
             <w:tcBorders>
               <w:top w:val="single" w:sz="4" w:space="0" w:color="8C8C8C"/>
               <w:left w:val="single" w:sz="4" w:space="0" w:color="8C8C8C"/>
@@ -11762,7 +11778,7 @@
         </w:tc>
         <w:tc>
           <w:tcPr>
-            <w:tcW w:type="dxa" w:w="4669"/>
+            <w:tcW w:type="dxa" w:w="5028"/>
             <w:tcBorders>
               <w:top w:val="single" w:sz="4" w:space="0" w:color="8C8C8C"/>
               <w:left w:val="single" w:sz="4" w:space="0" w:color="8C8C8C"/>
@@ -11790,7 +11806,7 @@
         </w:tc>
         <w:tc>
           <w:tcPr>
-            <w:tcW w:type="dxa" w:w="1323"/>
+            <w:tcW w:type="dxa" w:w="1571"/>
             <w:tcBorders>
               <w:top w:val="single" w:sz="4" w:space="0" w:color="8C8C8C"/>
               <w:left w:val="single" w:sz="4" w:space="0" w:color="8C8C8C"/>
@@ -11819,7 +11835,7 @@
         </w:tc>
         <w:tc>
           <w:tcPr>
-            <w:tcW w:type="dxa" w:w="1867"/>
+            <w:tcW w:type="dxa" w:w="1320"/>
             <w:tcBorders>
               <w:top w:val="single" w:sz="4" w:space="0" w:color="8C8C8C"/>
               <w:left w:val="single" w:sz="4" w:space="0" w:color="8C8C8C"/>
@@ -11849,7 +11865,7 @@
       <w:tr>
         <w:tc>
           <w:tcPr>
-            <w:tcW w:type="dxa" w:w="1167"/>
+            <w:tcW w:type="dxa" w:w="1106"/>
             <w:tcBorders>
               <w:top w:val="single" w:sz="4" w:space="0" w:color="8C8C8C"/>
               <w:left w:val="single" w:sz="4" w:space="0" w:color="8C8C8C"/>
@@ -11877,7 +11893,7 @@
         </w:tc>
         <w:tc>
           <w:tcPr>
-            <w:tcW w:type="dxa" w:w="4669"/>
+            <w:tcW w:type="dxa" w:w="5028"/>
             <w:tcBorders>
               <w:top w:val="single" w:sz="4" w:space="0" w:color="8C8C8C"/>
               <w:left w:val="single" w:sz="4" w:space="0" w:color="8C8C8C"/>
@@ -11905,7 +11921,7 @@
         </w:tc>
         <w:tc>
           <w:tcPr>
-            <w:tcW w:type="dxa" w:w="1323"/>
+            <w:tcW w:type="dxa" w:w="1571"/>
             <w:tcBorders>
               <w:top w:val="single" w:sz="4" w:space="0" w:color="8C8C8C"/>
               <w:left w:val="single" w:sz="4" w:space="0" w:color="8C8C8C"/>
@@ -11934,7 +11950,7 @@
         </w:tc>
         <w:tc>
           <w:tcPr>
-            <w:tcW w:type="dxa" w:w="1867"/>
+            <w:tcW w:type="dxa" w:w="1320"/>
             <w:tcBorders>
               <w:top w:val="single" w:sz="4" w:space="0" w:color="8C8C8C"/>
               <w:left w:val="single" w:sz="4" w:space="0" w:color="8C8C8C"/>
@@ -12336,17 +12352,19 @@
       <w:tblPr>
         <w:tblW w:type="auto" w:w="0"/>
         <w:jc w:val="center"/>
+        <w:tblLayout w:type="fixed"/>
         <w:tblLook w:firstColumn="1" w:firstRow="1" w:lastColumn="0" w:lastRow="0" w:noHBand="0" w:noVBand="1" w:val="04A0"/>
+        <w:tblLayout w:type="fixed"/>
       </w:tblPr>
       <w:tblGrid>
-        <w:gridCol w:w="3009"/>
-        <w:gridCol w:w="3009"/>
-        <w:gridCol w:w="3009"/>
+        <w:gridCol w:w="1586"/>
+        <w:gridCol w:w="4468"/>
+        <w:gridCol w:w="2971"/>
       </w:tblGrid>
       <w:tr>
         <w:tc>
           <w:tcPr>
-            <w:tcW w:type="dxa" w:w="1576"/>
+            <w:tcW w:type="dxa" w:w="1586"/>
             <w:tcBorders>
               <w:top w:val="single" w:sz="4" w:space="0" w:color="8C8C8C"/>
               <w:left w:val="single" w:sz="4" w:space="0" w:color="8C8C8C"/>
@@ -12376,7 +12394,7 @@
         </w:tc>
         <w:tc>
           <w:tcPr>
-            <w:tcW w:type="dxa" w:w="4298"/>
+            <w:tcW w:type="dxa" w:w="4468"/>
             <w:tcBorders>
               <w:top w:val="single" w:sz="4" w:space="0" w:color="8C8C8C"/>
               <w:left w:val="single" w:sz="4" w:space="0" w:color="8C8C8C"/>
@@ -12406,7 +12424,7 @@
         </w:tc>
         <w:tc>
           <w:tcPr>
-            <w:tcW w:type="dxa" w:w="3152"/>
+            <w:tcW w:type="dxa" w:w="2971"/>
             <w:tcBorders>
               <w:top w:val="single" w:sz="4" w:space="0" w:color="8C8C8C"/>
               <w:left w:val="single" w:sz="4" w:space="0" w:color="8C8C8C"/>
@@ -12438,7 +12456,7 @@
       <w:tr>
         <w:tc>
           <w:tcPr>
-            <w:tcW w:type="dxa" w:w="1576"/>
+            <w:tcW w:type="dxa" w:w="1586"/>
             <w:tcBorders>
               <w:top w:val="single" w:sz="4" w:space="0" w:color="8C8C8C"/>
               <w:left w:val="single" w:sz="4" w:space="0" w:color="8C8C8C"/>
@@ -12467,7 +12485,7 @@
         </w:tc>
         <w:tc>
           <w:tcPr>
-            <w:tcW w:type="dxa" w:w="4298"/>
+            <w:tcW w:type="dxa" w:w="4468"/>
             <w:tcBorders>
               <w:top w:val="single" w:sz="4" w:space="0" w:color="8C8C8C"/>
               <w:left w:val="single" w:sz="4" w:space="0" w:color="8C8C8C"/>
@@ -12509,7 +12527,7 @@
         </w:tc>
         <w:tc>
           <w:tcPr>
-            <w:tcW w:type="dxa" w:w="3152"/>
+            <w:tcW w:type="dxa" w:w="2971"/>
             <w:tcBorders>
               <w:top w:val="single" w:sz="4" w:space="0" w:color="8C8C8C"/>
               <w:left w:val="single" w:sz="4" w:space="0" w:color="8C8C8C"/>
@@ -12546,7 +12564,7 @@
       <w:tr>
         <w:tc>
           <w:tcPr>
-            <w:tcW w:type="dxa" w:w="1576"/>
+            <w:tcW w:type="dxa" w:w="1586"/>
             <w:tcBorders>
               <w:top w:val="single" w:sz="4" w:space="0" w:color="8C8C8C"/>
               <w:left w:val="single" w:sz="4" w:space="0" w:color="8C8C8C"/>
@@ -12575,7 +12593,7 @@
         </w:tc>
         <w:tc>
           <w:tcPr>
-            <w:tcW w:type="dxa" w:w="4298"/>
+            <w:tcW w:type="dxa" w:w="4468"/>
             <w:tcBorders>
               <w:top w:val="single" w:sz="4" w:space="0" w:color="8C8C8C"/>
               <w:left w:val="single" w:sz="4" w:space="0" w:color="8C8C8C"/>
@@ -12617,7 +12635,7 @@
         </w:tc>
         <w:tc>
           <w:tcPr>
-            <w:tcW w:type="dxa" w:w="3152"/>
+            <w:tcW w:type="dxa" w:w="2971"/>
             <w:tcBorders>
               <w:top w:val="single" w:sz="4" w:space="0" w:color="8C8C8C"/>
               <w:left w:val="single" w:sz="4" w:space="0" w:color="8C8C8C"/>
@@ -12654,7 +12672,7 @@
       <w:tr>
         <w:tc>
           <w:tcPr>
-            <w:tcW w:type="dxa" w:w="1576"/>
+            <w:tcW w:type="dxa" w:w="1586"/>
             <w:tcBorders>
               <w:top w:val="single" w:sz="4" w:space="0" w:color="8C8C8C"/>
               <w:left w:val="single" w:sz="4" w:space="0" w:color="8C8C8C"/>
@@ -12683,7 +12701,7 @@
         </w:tc>
         <w:tc>
           <w:tcPr>
-            <w:tcW w:type="dxa" w:w="4298"/>
+            <w:tcW w:type="dxa" w:w="4468"/>
             <w:tcBorders>
               <w:top w:val="single" w:sz="4" w:space="0" w:color="8C8C8C"/>
               <w:left w:val="single" w:sz="4" w:space="0" w:color="8C8C8C"/>
@@ -12790,7 +12808,7 @@
         </w:tc>
         <w:tc>
           <w:tcPr>
-            <w:tcW w:type="dxa" w:w="3152"/>
+            <w:tcW w:type="dxa" w:w="2971"/>
             <w:tcBorders>
               <w:top w:val="single" w:sz="4" w:space="0" w:color="8C8C8C"/>
               <w:left w:val="single" w:sz="4" w:space="0" w:color="8C8C8C"/>
@@ -12821,7 +12839,7 @@
       <w:tr>
         <w:tc>
           <w:tcPr>
-            <w:tcW w:type="dxa" w:w="1576"/>
+            <w:tcW w:type="dxa" w:w="1586"/>
             <w:tcBorders>
               <w:top w:val="single" w:sz="4" w:space="0" w:color="8C8C8C"/>
               <w:left w:val="single" w:sz="4" w:space="0" w:color="8C8C8C"/>
@@ -12850,7 +12868,7 @@
         </w:tc>
         <w:tc>
           <w:tcPr>
-            <w:tcW w:type="dxa" w:w="4298"/>
+            <w:tcW w:type="dxa" w:w="4468"/>
             <w:tcBorders>
               <w:top w:val="single" w:sz="4" w:space="0" w:color="8C8C8C"/>
               <w:left w:val="single" w:sz="4" w:space="0" w:color="8C8C8C"/>
@@ -12878,7 +12896,7 @@
         </w:tc>
         <w:tc>
           <w:tcPr>
-            <w:tcW w:type="dxa" w:w="3152"/>
+            <w:tcW w:type="dxa" w:w="2971"/>
             <w:tcBorders>
               <w:top w:val="single" w:sz="4" w:space="0" w:color="8C8C8C"/>
               <w:left w:val="single" w:sz="4" w:space="0" w:color="8C8C8C"/>
@@ -12973,18 +12991,20 @@
       <w:tblPr>
         <w:tblW w:type="auto" w:w="0"/>
         <w:jc w:val="center"/>
+        <w:tblLayout w:type="fixed"/>
         <w:tblLook w:firstColumn="1" w:firstRow="1" w:lastColumn="0" w:lastRow="0" w:noHBand="0" w:noVBand="1" w:val="04A0"/>
+        <w:tblLayout w:type="fixed"/>
       </w:tblPr>
       <w:tblGrid>
-        <w:gridCol w:w="2256"/>
-        <w:gridCol w:w="2256"/>
-        <w:gridCol w:w="2256"/>
-        <w:gridCol w:w="2256"/>
+        <w:gridCol w:w="2284"/>
+        <w:gridCol w:w="2128"/>
+        <w:gridCol w:w="1270"/>
+        <w:gridCol w:w="3343"/>
       </w:tblGrid>
       <w:tr>
         <w:tc>
           <w:tcPr>
-            <w:tcW w:type="dxa" w:w="2289"/>
+            <w:tcW w:type="dxa" w:w="2284"/>
             <w:tcBorders>
               <w:top w:val="single" w:sz="4" w:space="0" w:color="8C8C8C"/>
               <w:left w:val="single" w:sz="4" w:space="0" w:color="8C8C8C"/>
@@ -13014,7 +13034,7 @@
         </w:tc>
         <w:tc>
           <w:tcPr>
-            <w:tcW w:type="dxa" w:w="2591"/>
+            <w:tcW w:type="dxa" w:w="2128"/>
             <w:tcBorders>
               <w:top w:val="single" w:sz="4" w:space="0" w:color="8C8C8C"/>
               <w:left w:val="single" w:sz="4" w:space="0" w:color="8C8C8C"/>
@@ -13044,7 +13064,7 @@
         </w:tc>
         <w:tc>
           <w:tcPr>
-            <w:tcW w:type="dxa" w:w="1555"/>
+            <w:tcW w:type="dxa" w:w="1270"/>
             <w:tcBorders>
               <w:top w:val="single" w:sz="4" w:space="0" w:color="8C8C8C"/>
               <w:left w:val="single" w:sz="4" w:space="0" w:color="8C8C8C"/>
@@ -13074,7 +13094,7 @@
         </w:tc>
         <w:tc>
           <w:tcPr>
-            <w:tcW w:type="dxa" w:w="2591"/>
+            <w:tcW w:type="dxa" w:w="3343"/>
             <w:tcBorders>
               <w:top w:val="single" w:sz="4" w:space="0" w:color="8C8C8C"/>
               <w:left w:val="single" w:sz="4" w:space="0" w:color="8C8C8C"/>
@@ -13106,7 +13126,7 @@
       <w:tr>
         <w:tc>
           <w:tcPr>
-            <w:tcW w:type="dxa" w:w="2289"/>
+            <w:tcW w:type="dxa" w:w="2284"/>
             <w:tcBorders>
               <w:top w:val="single" w:sz="4" w:space="0" w:color="8C8C8C"/>
               <w:left w:val="single" w:sz="4" w:space="0" w:color="8C8C8C"/>
@@ -13141,7 +13161,7 @@
         </w:tc>
         <w:tc>
           <w:tcPr>
-            <w:tcW w:type="dxa" w:w="2591"/>
+            <w:tcW w:type="dxa" w:w="2128"/>
             <w:tcBorders>
               <w:top w:val="single" w:sz="4" w:space="0" w:color="8C8C8C"/>
               <w:left w:val="single" w:sz="4" w:space="0" w:color="8C8C8C"/>
@@ -13170,7 +13190,7 @@
         </w:tc>
         <w:tc>
           <w:tcPr>
-            <w:tcW w:type="dxa" w:w="1555"/>
+            <w:tcW w:type="dxa" w:w="1270"/>
             <w:tcBorders>
               <w:top w:val="single" w:sz="4" w:space="0" w:color="8C8C8C"/>
               <w:left w:val="single" w:sz="4" w:space="0" w:color="8C8C8C"/>
@@ -13225,7 +13245,7 @@
         </w:tc>
         <w:tc>
           <w:tcPr>
-            <w:tcW w:type="dxa" w:w="2591"/>
+            <w:tcW w:type="dxa" w:w="3343"/>
             <w:tcBorders>
               <w:top w:val="single" w:sz="4" w:space="0" w:color="8C8C8C"/>
               <w:left w:val="single" w:sz="4" w:space="0" w:color="8C8C8C"/>
@@ -13275,7 +13295,7 @@
       <w:tr>
         <w:tc>
           <w:tcPr>
-            <w:tcW w:type="dxa" w:w="2289"/>
+            <w:tcW w:type="dxa" w:w="2284"/>
             <w:tcBorders>
               <w:top w:val="single" w:sz="4" w:space="0" w:color="8C8C8C"/>
               <w:left w:val="single" w:sz="4" w:space="0" w:color="8C8C8C"/>
@@ -13310,7 +13330,7 @@
         </w:tc>
         <w:tc>
           <w:tcPr>
-            <w:tcW w:type="dxa" w:w="2591"/>
+            <w:tcW w:type="dxa" w:w="2128"/>
             <w:tcBorders>
               <w:top w:val="single" w:sz="4" w:space="0" w:color="8C8C8C"/>
               <w:left w:val="single" w:sz="4" w:space="0" w:color="8C8C8C"/>
@@ -13339,7 +13359,7 @@
         </w:tc>
         <w:tc>
           <w:tcPr>
-            <w:tcW w:type="dxa" w:w="1555"/>
+            <w:tcW w:type="dxa" w:w="1270"/>
             <w:tcBorders>
               <w:top w:val="single" w:sz="4" w:space="0" w:color="8C8C8C"/>
               <w:left w:val="single" w:sz="4" w:space="0" w:color="8C8C8C"/>
@@ -13368,7 +13388,7 @@
         </w:tc>
         <w:tc>
           <w:tcPr>
-            <w:tcW w:type="dxa" w:w="2591"/>
+            <w:tcW w:type="dxa" w:w="3343"/>
             <w:tcBorders>
               <w:top w:val="single" w:sz="4" w:space="0" w:color="8C8C8C"/>
               <w:left w:val="single" w:sz="4" w:space="0" w:color="8C8C8C"/>
@@ -13425,7 +13445,7 @@
       <w:tr>
         <w:tc>
           <w:tcPr>
-            <w:tcW w:type="dxa" w:w="2289"/>
+            <w:tcW w:type="dxa" w:w="2284"/>
             <w:tcBorders>
               <w:top w:val="single" w:sz="4" w:space="0" w:color="8C8C8C"/>
               <w:left w:val="single" w:sz="4" w:space="0" w:color="8C8C8C"/>
@@ -13473,7 +13493,7 @@
         </w:tc>
         <w:tc>
           <w:tcPr>
-            <w:tcW w:type="dxa" w:w="2591"/>
+            <w:tcW w:type="dxa" w:w="2128"/>
             <w:tcBorders>
               <w:top w:val="single" w:sz="4" w:space="0" w:color="8C8C8C"/>
               <w:left w:val="single" w:sz="4" w:space="0" w:color="8C8C8C"/>
@@ -13515,7 +13535,7 @@
         </w:tc>
         <w:tc>
           <w:tcPr>
-            <w:tcW w:type="dxa" w:w="1555"/>
+            <w:tcW w:type="dxa" w:w="1270"/>
             <w:tcBorders>
               <w:top w:val="single" w:sz="4" w:space="0" w:color="8C8C8C"/>
               <w:left w:val="single" w:sz="4" w:space="0" w:color="8C8C8C"/>
@@ -13544,7 +13564,7 @@
         </w:tc>
         <w:tc>
           <w:tcPr>
-            <w:tcW w:type="dxa" w:w="2591"/>
+            <w:tcW w:type="dxa" w:w="3343"/>
             <w:tcBorders>
               <w:top w:val="single" w:sz="4" w:space="0" w:color="8C8C8C"/>
               <w:left w:val="single" w:sz="4" w:space="0" w:color="8C8C8C"/>
@@ -13588,7 +13608,7 @@
       <w:tr>
         <w:tc>
           <w:tcPr>
-            <w:tcW w:type="dxa" w:w="2289"/>
+            <w:tcW w:type="dxa" w:w="2284"/>
             <w:tcBorders>
               <w:top w:val="single" w:sz="4" w:space="0" w:color="8C8C8C"/>
               <w:left w:val="single" w:sz="4" w:space="0" w:color="8C8C8C"/>
@@ -13636,7 +13656,7 @@
         </w:tc>
         <w:tc>
           <w:tcPr>
-            <w:tcW w:type="dxa" w:w="2591"/>
+            <w:tcW w:type="dxa" w:w="2128"/>
             <w:tcBorders>
               <w:top w:val="single" w:sz="4" w:space="0" w:color="8C8C8C"/>
               <w:left w:val="single" w:sz="4" w:space="0" w:color="8C8C8C"/>
@@ -13703,7 +13723,7 @@
         </w:tc>
         <w:tc>
           <w:tcPr>
-            <w:tcW w:type="dxa" w:w="1555"/>
+            <w:tcW w:type="dxa" w:w="1270"/>
             <w:tcBorders>
               <w:top w:val="single" w:sz="4" w:space="0" w:color="8C8C8C"/>
               <w:left w:val="single" w:sz="4" w:space="0" w:color="8C8C8C"/>
@@ -13732,7 +13752,7 @@
         </w:tc>
         <w:tc>
           <w:tcPr>
-            <w:tcW w:type="dxa" w:w="2591"/>
+            <w:tcW w:type="dxa" w:w="3343"/>
             <w:tcBorders>
               <w:top w:val="single" w:sz="4" w:space="0" w:color="8C8C8C"/>
               <w:left w:val="single" w:sz="4" w:space="0" w:color="8C8C8C"/>
@@ -13776,7 +13796,7 @@
       <w:tr>
         <w:tc>
           <w:tcPr>
-            <w:tcW w:type="dxa" w:w="2289"/>
+            <w:tcW w:type="dxa" w:w="2284"/>
             <w:tcBorders>
               <w:top w:val="single" w:sz="4" w:space="0" w:color="8C8C8C"/>
               <w:left w:val="single" w:sz="4" w:space="0" w:color="8C8C8C"/>
@@ -13811,7 +13831,7 @@
         </w:tc>
         <w:tc>
           <w:tcPr>
-            <w:tcW w:type="dxa" w:w="2591"/>
+            <w:tcW w:type="dxa" w:w="2128"/>
             <w:tcBorders>
               <w:top w:val="single" w:sz="4" w:space="0" w:color="8C8C8C"/>
               <w:left w:val="single" w:sz="4" w:space="0" w:color="8C8C8C"/>
@@ -13840,7 +13860,7 @@
         </w:tc>
         <w:tc>
           <w:tcPr>
-            <w:tcW w:type="dxa" w:w="1555"/>
+            <w:tcW w:type="dxa" w:w="1270"/>
             <w:tcBorders>
               <w:top w:val="single" w:sz="4" w:space="0" w:color="8C8C8C"/>
               <w:left w:val="single" w:sz="4" w:space="0" w:color="8C8C8C"/>
@@ -13868,7 +13888,7 @@
         </w:tc>
         <w:tc>
           <w:tcPr>
-            <w:tcW w:type="dxa" w:w="2591"/>
+            <w:tcW w:type="dxa" w:w="3343"/>
             <w:tcBorders>
               <w:top w:val="single" w:sz="4" w:space="0" w:color="8C8C8C"/>
               <w:left w:val="single" w:sz="4" w:space="0" w:color="8C8C8C"/>
@@ -13925,7 +13945,7 @@
       <w:tr>
         <w:tc>
           <w:tcPr>
-            <w:tcW w:type="dxa" w:w="2289"/>
+            <w:tcW w:type="dxa" w:w="2284"/>
             <w:tcBorders>
               <w:top w:val="single" w:sz="4" w:space="0" w:color="8C8C8C"/>
               <w:left w:val="single" w:sz="4" w:space="0" w:color="8C8C8C"/>
@@ -13954,7 +13974,7 @@
         </w:tc>
         <w:tc>
           <w:tcPr>
-            <w:tcW w:type="dxa" w:w="2591"/>
+            <w:tcW w:type="dxa" w:w="2128"/>
             <w:tcBorders>
               <w:top w:val="single" w:sz="4" w:space="0" w:color="8C8C8C"/>
               <w:left w:val="single" w:sz="4" w:space="0" w:color="8C8C8C"/>
@@ -13983,7 +14003,7 @@
         </w:tc>
         <w:tc>
           <w:tcPr>
-            <w:tcW w:type="dxa" w:w="1555"/>
+            <w:tcW w:type="dxa" w:w="1270"/>
             <w:tcBorders>
               <w:top w:val="single" w:sz="4" w:space="0" w:color="8C8C8C"/>
               <w:left w:val="single" w:sz="4" w:space="0" w:color="8C8C8C"/>
@@ -14018,7 +14038,7 @@
         </w:tc>
         <w:tc>
           <w:tcPr>
-            <w:tcW w:type="dxa" w:w="2591"/>
+            <w:tcW w:type="dxa" w:w="3343"/>
             <w:tcBorders>
               <w:top w:val="single" w:sz="4" w:space="0" w:color="8C8C8C"/>
               <w:left w:val="single" w:sz="4" w:space="0" w:color="8C8C8C"/>
@@ -14291,17 +14311,19 @@
       <w:tblPr>
         <w:tblW w:type="auto" w:w="0"/>
         <w:jc w:val="center"/>
+        <w:tblLayout w:type="fixed"/>
         <w:tblLook w:firstColumn="1" w:firstRow="1" w:lastColumn="0" w:lastRow="0" w:noHBand="0" w:noVBand="1" w:val="04A0"/>
+        <w:tblLayout w:type="fixed"/>
       </w:tblPr>
       <w:tblGrid>
-        <w:gridCol w:w="3009"/>
-        <w:gridCol w:w="3009"/>
-        <w:gridCol w:w="3009"/>
+        <w:gridCol w:w="1065"/>
+        <w:gridCol w:w="3981"/>
+        <w:gridCol w:w="3981"/>
       </w:tblGrid>
       <w:tr>
         <w:tc>
           <w:tcPr>
-            <w:tcW w:type="dxa" w:w="2127"/>
+            <w:tcW w:type="dxa" w:w="1065"/>
             <w:tcBorders>
               <w:top w:val="single" w:sz="4" w:space="0" w:color="8C8C8C"/>
               <w:left w:val="single" w:sz="4" w:space="0" w:color="8C8C8C"/>
@@ -14331,7 +14353,7 @@
         </w:tc>
         <w:tc>
           <w:tcPr>
-            <w:tcW w:type="dxa" w:w="3449"/>
+            <w:tcW w:type="dxa" w:w="3981"/>
             <w:tcBorders>
               <w:top w:val="single" w:sz="4" w:space="0" w:color="8C8C8C"/>
               <w:left w:val="single" w:sz="4" w:space="0" w:color="8C8C8C"/>
@@ -14361,7 +14383,7 @@
         </w:tc>
         <w:tc>
           <w:tcPr>
-            <w:tcW w:type="dxa" w:w="3449"/>
+            <w:tcW w:type="dxa" w:w="3981"/>
             <w:tcBorders>
               <w:top w:val="single" w:sz="4" w:space="0" w:color="8C8C8C"/>
               <w:left w:val="single" w:sz="4" w:space="0" w:color="8C8C8C"/>
@@ -14393,7 +14415,7 @@
       <w:tr>
         <w:tc>
           <w:tcPr>
-            <w:tcW w:type="dxa" w:w="2127"/>
+            <w:tcW w:type="dxa" w:w="1065"/>
             <w:tcBorders>
               <w:top w:val="single" w:sz="4" w:space="0" w:color="8C8C8C"/>
               <w:left w:val="single" w:sz="4" w:space="0" w:color="8C8C8C"/>
@@ -14421,7 +14443,7 @@
         </w:tc>
         <w:tc>
           <w:tcPr>
-            <w:tcW w:type="dxa" w:w="3449"/>
+            <w:tcW w:type="dxa" w:w="3981"/>
             <w:tcBorders>
               <w:top w:val="single" w:sz="4" w:space="0" w:color="8C8C8C"/>
               <w:left w:val="single" w:sz="4" w:space="0" w:color="8C8C8C"/>
@@ -14482,7 +14504,7 @@
         </w:tc>
         <w:tc>
           <w:tcPr>
-            <w:tcW w:type="dxa" w:w="3449"/>
+            <w:tcW w:type="dxa" w:w="3981"/>
             <w:tcBorders>
               <w:top w:val="single" w:sz="4" w:space="0" w:color="8C8C8C"/>
               <w:left w:val="single" w:sz="4" w:space="0" w:color="8C8C8C"/>
@@ -14512,7 +14534,7 @@
       <w:tr>
         <w:tc>
           <w:tcPr>
-            <w:tcW w:type="dxa" w:w="2127"/>
+            <w:tcW w:type="dxa" w:w="1065"/>
             <w:tcBorders>
               <w:top w:val="single" w:sz="4" w:space="0" w:color="8C8C8C"/>
               <w:left w:val="single" w:sz="4" w:space="0" w:color="8C8C8C"/>
@@ -14540,7 +14562,7 @@
         </w:tc>
         <w:tc>
           <w:tcPr>
-            <w:tcW w:type="dxa" w:w="3449"/>
+            <w:tcW w:type="dxa" w:w="3981"/>
             <w:tcBorders>
               <w:top w:val="single" w:sz="4" w:space="0" w:color="8C8C8C"/>
               <w:left w:val="single" w:sz="4" w:space="0" w:color="8C8C8C"/>
@@ -14621,7 +14643,7 @@
         </w:tc>
         <w:tc>
           <w:tcPr>
-            <w:tcW w:type="dxa" w:w="3449"/>
+            <w:tcW w:type="dxa" w:w="3981"/>
             <w:tcBorders>
               <w:top w:val="single" w:sz="4" w:space="0" w:color="8C8C8C"/>
               <w:left w:val="single" w:sz="4" w:space="0" w:color="8C8C8C"/>
@@ -14729,7 +14751,7 @@
       <w:tr>
         <w:tc>
           <w:tcPr>
-            <w:tcW w:type="dxa" w:w="2127"/>
+            <w:tcW w:type="dxa" w:w="1065"/>
             <w:tcBorders>
               <w:top w:val="single" w:sz="4" w:space="0" w:color="8C8C8C"/>
               <w:left w:val="single" w:sz="4" w:space="0" w:color="8C8C8C"/>
@@ -14757,7 +14779,7 @@
         </w:tc>
         <w:tc>
           <w:tcPr>
-            <w:tcW w:type="dxa" w:w="3449"/>
+            <w:tcW w:type="dxa" w:w="3981"/>
             <w:tcBorders>
               <w:top w:val="single" w:sz="4" w:space="0" w:color="8C8C8C"/>
               <w:left w:val="single" w:sz="4" w:space="0" w:color="8C8C8C"/>
@@ -14915,7 +14937,7 @@
         </w:tc>
         <w:tc>
           <w:tcPr>
-            <w:tcW w:type="dxa" w:w="3449"/>
+            <w:tcW w:type="dxa" w:w="3981"/>
             <w:tcBorders>
               <w:top w:val="single" w:sz="4" w:space="0" w:color="8C8C8C"/>
               <w:left w:val="single" w:sz="4" w:space="0" w:color="8C8C8C"/>
@@ -14945,7 +14967,7 @@
       <w:tr>
         <w:tc>
           <w:tcPr>
-            <w:tcW w:type="dxa" w:w="2127"/>
+            <w:tcW w:type="dxa" w:w="1065"/>
             <w:tcBorders>
               <w:top w:val="single" w:sz="4" w:space="0" w:color="8C8C8C"/>
               <w:left w:val="single" w:sz="4" w:space="0" w:color="8C8C8C"/>
@@ -14973,7 +14995,7 @@
         </w:tc>
         <w:tc>
           <w:tcPr>
-            <w:tcW w:type="dxa" w:w="3449"/>
+            <w:tcW w:type="dxa" w:w="3981"/>
             <w:tcBorders>
               <w:top w:val="single" w:sz="4" w:space="0" w:color="8C8C8C"/>
               <w:left w:val="single" w:sz="4" w:space="0" w:color="8C8C8C"/>
@@ -15021,7 +15043,7 @@
         </w:tc>
         <w:tc>
           <w:tcPr>
-            <w:tcW w:type="dxa" w:w="3449"/>
+            <w:tcW w:type="dxa" w:w="3981"/>
             <w:tcBorders>
               <w:top w:val="single" w:sz="4" w:space="0" w:color="8C8C8C"/>
               <w:left w:val="single" w:sz="4" w:space="0" w:color="8C8C8C"/>
@@ -15051,7 +15073,7 @@
       <w:tr>
         <w:tc>
           <w:tcPr>
-            <w:tcW w:type="dxa" w:w="2127"/>
+            <w:tcW w:type="dxa" w:w="1065"/>
             <w:tcBorders>
               <w:top w:val="single" w:sz="4" w:space="0" w:color="8C8C8C"/>
               <w:left w:val="single" w:sz="4" w:space="0" w:color="8C8C8C"/>
@@ -15079,7 +15101,7 @@
         </w:tc>
         <w:tc>
           <w:tcPr>
-            <w:tcW w:type="dxa" w:w="3449"/>
+            <w:tcW w:type="dxa" w:w="3981"/>
             <w:tcBorders>
               <w:top w:val="single" w:sz="4" w:space="0" w:color="8C8C8C"/>
               <w:left w:val="single" w:sz="4" w:space="0" w:color="8C8C8C"/>
@@ -15166,7 +15188,7 @@
         </w:tc>
         <w:tc>
           <w:tcPr>
-            <w:tcW w:type="dxa" w:w="3449"/>
+            <w:tcW w:type="dxa" w:w="3981"/>
             <w:tcBorders>
               <w:top w:val="single" w:sz="4" w:space="0" w:color="8C8C8C"/>
               <w:left w:val="single" w:sz="4" w:space="0" w:color="8C8C8C"/>
@@ -15209,7 +15231,7 @@
       <w:tr>
         <w:tc>
           <w:tcPr>
-            <w:tcW w:type="dxa" w:w="2127"/>
+            <w:tcW w:type="dxa" w:w="1065"/>
             <w:tcBorders>
               <w:top w:val="single" w:sz="4" w:space="0" w:color="8C8C8C"/>
               <w:left w:val="single" w:sz="4" w:space="0" w:color="8C8C8C"/>
@@ -15237,7 +15259,7 @@
         </w:tc>
         <w:tc>
           <w:tcPr>
-            <w:tcW w:type="dxa" w:w="3449"/>
+            <w:tcW w:type="dxa" w:w="3981"/>
             <w:tcBorders>
               <w:top w:val="single" w:sz="4" w:space="0" w:color="8C8C8C"/>
               <w:left w:val="single" w:sz="4" w:space="0" w:color="8C8C8C"/>
@@ -15285,7 +15307,7 @@
         </w:tc>
         <w:tc>
           <w:tcPr>
-            <w:tcW w:type="dxa" w:w="3449"/>
+            <w:tcW w:type="dxa" w:w="3981"/>
             <w:tcBorders>
               <w:top w:val="single" w:sz="4" w:space="0" w:color="8C8C8C"/>
               <w:left w:val="single" w:sz="4" w:space="0" w:color="8C8C8C"/>
@@ -15328,7 +15350,7 @@
       <w:tr>
         <w:tc>
           <w:tcPr>
-            <w:tcW w:type="dxa" w:w="2127"/>
+            <w:tcW w:type="dxa" w:w="1065"/>
             <w:tcBorders>
               <w:top w:val="single" w:sz="4" w:space="0" w:color="8C8C8C"/>
               <w:left w:val="single" w:sz="4" w:space="0" w:color="8C8C8C"/>
@@ -15356,7 +15378,7 @@
         </w:tc>
         <w:tc>
           <w:tcPr>
-            <w:tcW w:type="dxa" w:w="3449"/>
+            <w:tcW w:type="dxa" w:w="3981"/>
             <w:tcBorders>
               <w:top w:val="single" w:sz="4" w:space="0" w:color="8C8C8C"/>
               <w:left w:val="single" w:sz="4" w:space="0" w:color="8C8C8C"/>
@@ -15424,7 +15446,7 @@
         </w:tc>
         <w:tc>
           <w:tcPr>
-            <w:tcW w:type="dxa" w:w="3449"/>
+            <w:tcW w:type="dxa" w:w="3981"/>
             <w:tcBorders>
               <w:top w:val="single" w:sz="4" w:space="0" w:color="8C8C8C"/>
               <w:left w:val="single" w:sz="4" w:space="0" w:color="8C8C8C"/>
@@ -15461,7 +15483,7 @@
       <w:tr>
         <w:tc>
           <w:tcPr>
-            <w:tcW w:type="dxa" w:w="2127"/>
+            <w:tcW w:type="dxa" w:w="1065"/>
             <w:tcBorders>
               <w:top w:val="single" w:sz="4" w:space="0" w:color="8C8C8C"/>
               <w:left w:val="single" w:sz="4" w:space="0" w:color="8C8C8C"/>
@@ -15489,7 +15511,7 @@
         </w:tc>
         <w:tc>
           <w:tcPr>
-            <w:tcW w:type="dxa" w:w="3449"/>
+            <w:tcW w:type="dxa" w:w="3981"/>
             <w:tcBorders>
               <w:top w:val="single" w:sz="4" w:space="0" w:color="8C8C8C"/>
               <w:left w:val="single" w:sz="4" w:space="0" w:color="8C8C8C"/>
@@ -15576,7 +15598,7 @@
         </w:tc>
         <w:tc>
           <w:tcPr>
-            <w:tcW w:type="dxa" w:w="3449"/>
+            <w:tcW w:type="dxa" w:w="3981"/>
             <w:tcBorders>
               <w:top w:val="single" w:sz="4" w:space="0" w:color="8C8C8C"/>
               <w:left w:val="single" w:sz="4" w:space="0" w:color="8C8C8C"/>
@@ -15949,17 +15971,19 @@
       <w:tblPr>
         <w:tblW w:type="auto" w:w="0"/>
         <w:jc w:val="center"/>
+        <w:tblLayout w:type="fixed"/>
         <w:tblLook w:firstColumn="1" w:firstRow="1" w:lastColumn="0" w:lastRow="0" w:noHBand="0" w:noVBand="1" w:val="04A0"/>
+        <w:tblLayout w:type="fixed"/>
       </w:tblPr>
       <w:tblGrid>
-        <w:gridCol w:w="3009"/>
-        <w:gridCol w:w="3009"/>
-        <w:gridCol w:w="3009"/>
+        <w:gridCol w:w="2187"/>
+        <w:gridCol w:w="2774"/>
+        <w:gridCol w:w="4065"/>
       </w:tblGrid>
       <w:tr>
         <w:tc>
           <w:tcPr>
-            <w:tcW w:type="dxa" w:w="2299"/>
+            <w:tcW w:type="dxa" w:w="2187"/>
             <w:tcBorders>
               <w:top w:val="single" w:sz="4" w:space="0" w:color="8C8C8C"/>
               <w:left w:val="single" w:sz="4" w:space="0" w:color="8C8C8C"/>
@@ -15989,7 +16013,7 @@
         </w:tc>
         <w:tc>
           <w:tcPr>
-            <w:tcW w:type="dxa" w:w="3364"/>
+            <w:tcW w:type="dxa" w:w="2774"/>
             <w:tcBorders>
               <w:top w:val="single" w:sz="4" w:space="0" w:color="8C8C8C"/>
               <w:left w:val="single" w:sz="4" w:space="0" w:color="8C8C8C"/>
@@ -16019,7 +16043,7 @@
         </w:tc>
         <w:tc>
           <w:tcPr>
-            <w:tcW w:type="dxa" w:w="3364"/>
+            <w:tcW w:type="dxa" w:w="4065"/>
             <w:tcBorders>
               <w:top w:val="single" w:sz="4" w:space="0" w:color="8C8C8C"/>
               <w:left w:val="single" w:sz="4" w:space="0" w:color="8C8C8C"/>
@@ -16051,7 +16075,7 @@
       <w:tr>
         <w:tc>
           <w:tcPr>
-            <w:tcW w:type="dxa" w:w="2299"/>
+            <w:tcW w:type="dxa" w:w="2187"/>
             <w:tcBorders>
               <w:top w:val="single" w:sz="4" w:space="0" w:color="8C8C8C"/>
               <w:left w:val="single" w:sz="4" w:space="0" w:color="8C8C8C"/>
@@ -16079,7 +16103,7 @@
         </w:tc>
         <w:tc>
           <w:tcPr>
-            <w:tcW w:type="dxa" w:w="3364"/>
+            <w:tcW w:type="dxa" w:w="2774"/>
             <w:tcBorders>
               <w:top w:val="single" w:sz="4" w:space="0" w:color="8C8C8C"/>
               <w:left w:val="single" w:sz="4" w:space="0" w:color="8C8C8C"/>
@@ -16107,7 +16131,7 @@
         </w:tc>
         <w:tc>
           <w:tcPr>
-            <w:tcW w:type="dxa" w:w="3364"/>
+            <w:tcW w:type="dxa" w:w="4065"/>
             <w:tcBorders>
               <w:top w:val="single" w:sz="4" w:space="0" w:color="8C8C8C"/>
               <w:left w:val="single" w:sz="4" w:space="0" w:color="8C8C8C"/>
@@ -16151,7 +16175,7 @@
       <w:tr>
         <w:tc>
           <w:tcPr>
-            <w:tcW w:type="dxa" w:w="2299"/>
+            <w:tcW w:type="dxa" w:w="2187"/>
             <w:tcBorders>
               <w:top w:val="single" w:sz="4" w:space="0" w:color="8C8C8C"/>
               <w:left w:val="single" w:sz="4" w:space="0" w:color="8C8C8C"/>
@@ -16192,7 +16216,7 @@
         </w:tc>
         <w:tc>
           <w:tcPr>
-            <w:tcW w:type="dxa" w:w="3364"/>
+            <w:tcW w:type="dxa" w:w="2774"/>
             <w:tcBorders>
               <w:top w:val="single" w:sz="4" w:space="0" w:color="8C8C8C"/>
               <w:left w:val="single" w:sz="4" w:space="0" w:color="8C8C8C"/>
@@ -16220,7 +16244,7 @@
         </w:tc>
         <w:tc>
           <w:tcPr>
-            <w:tcW w:type="dxa" w:w="3364"/>
+            <w:tcW w:type="dxa" w:w="4065"/>
             <w:tcBorders>
               <w:top w:val="single" w:sz="4" w:space="0" w:color="8C8C8C"/>
               <w:left w:val="single" w:sz="4" w:space="0" w:color="8C8C8C"/>
@@ -16290,7 +16314,7 @@
       <w:tr>
         <w:tc>
           <w:tcPr>
-            <w:tcW w:type="dxa" w:w="2299"/>
+            <w:tcW w:type="dxa" w:w="2187"/>
             <w:tcBorders>
               <w:top w:val="single" w:sz="4" w:space="0" w:color="8C8C8C"/>
               <w:left w:val="single" w:sz="4" w:space="0" w:color="8C8C8C"/>
@@ -16318,7 +16342,7 @@
         </w:tc>
         <w:tc>
           <w:tcPr>
-            <w:tcW w:type="dxa" w:w="3364"/>
+            <w:tcW w:type="dxa" w:w="2774"/>
             <w:tcBorders>
               <w:top w:val="single" w:sz="4" w:space="0" w:color="8C8C8C"/>
               <w:left w:val="single" w:sz="4" w:space="0" w:color="8C8C8C"/>
@@ -16346,7 +16370,7 @@
         </w:tc>
         <w:tc>
           <w:tcPr>
-            <w:tcW w:type="dxa" w:w="3364"/>
+            <w:tcW w:type="dxa" w:w="4065"/>
             <w:tcBorders>
               <w:top w:val="single" w:sz="4" w:space="0" w:color="8C8C8C"/>
               <w:left w:val="single" w:sz="4" w:space="0" w:color="8C8C8C"/>
@@ -16390,7 +16414,7 @@
       <w:tr>
         <w:tc>
           <w:tcPr>
-            <w:tcW w:type="dxa" w:w="2299"/>
+            <w:tcW w:type="dxa" w:w="2187"/>
             <w:tcBorders>
               <w:top w:val="single" w:sz="4" w:space="0" w:color="8C8C8C"/>
               <w:left w:val="single" w:sz="4" w:space="0" w:color="8C8C8C"/>
@@ -16418,7 +16442,7 @@
         </w:tc>
         <w:tc>
           <w:tcPr>
-            <w:tcW w:type="dxa" w:w="3364"/>
+            <w:tcW w:type="dxa" w:w="2774"/>
             <w:tcBorders>
               <w:top w:val="single" w:sz="4" w:space="0" w:color="8C8C8C"/>
               <w:left w:val="single" w:sz="4" w:space="0" w:color="8C8C8C"/>
@@ -16446,7 +16470,7 @@
         </w:tc>
         <w:tc>
           <w:tcPr>
-            <w:tcW w:type="dxa" w:w="3364"/>
+            <w:tcW w:type="dxa" w:w="4065"/>
             <w:tcBorders>
               <w:top w:val="single" w:sz="4" w:space="0" w:color="8C8C8C"/>
               <w:left w:val="single" w:sz="4" w:space="0" w:color="8C8C8C"/>
@@ -16477,7 +16501,7 @@
       <w:tr>
         <w:tc>
           <w:tcPr>
-            <w:tcW w:type="dxa" w:w="2299"/>
+            <w:tcW w:type="dxa" w:w="2187"/>
             <w:tcBorders>
               <w:top w:val="single" w:sz="4" w:space="0" w:color="8C8C8C"/>
               <w:left w:val="single" w:sz="4" w:space="0" w:color="8C8C8C"/>
@@ -16505,7 +16529,7 @@
         </w:tc>
         <w:tc>
           <w:tcPr>
-            <w:tcW w:type="dxa" w:w="3364"/>
+            <w:tcW w:type="dxa" w:w="2774"/>
             <w:tcBorders>
               <w:top w:val="single" w:sz="4" w:space="0" w:color="8C8C8C"/>
               <w:left w:val="single" w:sz="4" w:space="0" w:color="8C8C8C"/>
@@ -16534,7 +16558,7 @@
         </w:tc>
         <w:tc>
           <w:tcPr>
-            <w:tcW w:type="dxa" w:w="3364"/>
+            <w:tcW w:type="dxa" w:w="4065"/>
             <w:tcBorders>
               <w:top w:val="single" w:sz="4" w:space="0" w:color="8C8C8C"/>
               <w:left w:val="single" w:sz="4" w:space="0" w:color="8C8C8C"/>
@@ -16565,7 +16589,7 @@
       <w:tr>
         <w:tc>
           <w:tcPr>
-            <w:tcW w:type="dxa" w:w="2299"/>
+            <w:tcW w:type="dxa" w:w="2187"/>
             <w:tcBorders>
               <w:top w:val="single" w:sz="4" w:space="0" w:color="8C8C8C"/>
               <w:left w:val="single" w:sz="4" w:space="0" w:color="8C8C8C"/>
@@ -16593,7 +16617,7 @@
         </w:tc>
         <w:tc>
           <w:tcPr>
-            <w:tcW w:type="dxa" w:w="3364"/>
+            <w:tcW w:type="dxa" w:w="2774"/>
             <w:tcBorders>
               <w:top w:val="single" w:sz="4" w:space="0" w:color="8C8C8C"/>
               <w:left w:val="single" w:sz="4" w:space="0" w:color="8C8C8C"/>
@@ -16621,7 +16645,7 @@
         </w:tc>
         <w:tc>
           <w:tcPr>
-            <w:tcW w:type="dxa" w:w="3364"/>
+            <w:tcW w:type="dxa" w:w="4065"/>
             <w:tcBorders>
               <w:top w:val="single" w:sz="4" w:space="0" w:color="8C8C8C"/>
               <w:left w:val="single" w:sz="4" w:space="0" w:color="8C8C8C"/>
@@ -16652,7 +16676,7 @@
       <w:tr>
         <w:tc>
           <w:tcPr>
-            <w:tcW w:type="dxa" w:w="2299"/>
+            <w:tcW w:type="dxa" w:w="2187"/>
             <w:tcBorders>
               <w:top w:val="single" w:sz="4" w:space="0" w:color="8C8C8C"/>
               <w:left w:val="single" w:sz="4" w:space="0" w:color="8C8C8C"/>
@@ -16680,7 +16704,7 @@
         </w:tc>
         <w:tc>
           <w:tcPr>
-            <w:tcW w:type="dxa" w:w="3364"/>
+            <w:tcW w:type="dxa" w:w="2774"/>
             <w:tcBorders>
               <w:top w:val="single" w:sz="4" w:space="0" w:color="8C8C8C"/>
               <w:left w:val="single" w:sz="4" w:space="0" w:color="8C8C8C"/>
@@ -16708,7 +16732,7 @@
         </w:tc>
         <w:tc>
           <w:tcPr>
-            <w:tcW w:type="dxa" w:w="3364"/>
+            <w:tcW w:type="dxa" w:w="4065"/>
             <w:tcBorders>
               <w:top w:val="single" w:sz="4" w:space="0" w:color="8C8C8C"/>
               <w:left w:val="single" w:sz="4" w:space="0" w:color="8C8C8C"/>
@@ -16745,7 +16769,7 @@
       <w:tr>
         <w:tc>
           <w:tcPr>
-            <w:tcW w:type="dxa" w:w="2299"/>
+            <w:tcW w:type="dxa" w:w="2187"/>
             <w:tcBorders>
               <w:top w:val="single" w:sz="4" w:space="0" w:color="8C8C8C"/>
               <w:left w:val="single" w:sz="4" w:space="0" w:color="8C8C8C"/>
@@ -16773,7 +16797,7 @@
         </w:tc>
         <w:tc>
           <w:tcPr>
-            <w:tcW w:type="dxa" w:w="3364"/>
+            <w:tcW w:type="dxa" w:w="2774"/>
             <w:tcBorders>
               <w:top w:val="single" w:sz="4" w:space="0" w:color="8C8C8C"/>
               <w:left w:val="single" w:sz="4" w:space="0" w:color="8C8C8C"/>
@@ -16802,7 +16826,7 @@
         </w:tc>
         <w:tc>
           <w:tcPr>
-            <w:tcW w:type="dxa" w:w="3364"/>
+            <w:tcW w:type="dxa" w:w="4065"/>
             <w:tcBorders>
               <w:top w:val="single" w:sz="4" w:space="0" w:color="8C8C8C"/>
               <w:left w:val="single" w:sz="4" w:space="0" w:color="8C8C8C"/>
@@ -16833,7 +16857,7 @@
       <w:tr>
         <w:tc>
           <w:tcPr>
-            <w:tcW w:type="dxa" w:w="2299"/>
+            <w:tcW w:type="dxa" w:w="2187"/>
             <w:tcBorders>
               <w:top w:val="single" w:sz="4" w:space="0" w:color="8C8C8C"/>
               <w:left w:val="single" w:sz="4" w:space="0" w:color="8C8C8C"/>
@@ -16861,7 +16885,7 @@
         </w:tc>
         <w:tc>
           <w:tcPr>
-            <w:tcW w:type="dxa" w:w="3364"/>
+            <w:tcW w:type="dxa" w:w="2774"/>
             <w:tcBorders>
               <w:top w:val="single" w:sz="4" w:space="0" w:color="8C8C8C"/>
               <w:left w:val="single" w:sz="4" w:space="0" w:color="8C8C8C"/>
@@ -16915,7 +16939,7 @@
         </w:tc>
         <w:tc>
           <w:tcPr>
-            <w:tcW w:type="dxa" w:w="3364"/>
+            <w:tcW w:type="dxa" w:w="4065"/>
             <w:tcBorders>
               <w:top w:val="single" w:sz="4" w:space="0" w:color="8C8C8C"/>
               <w:left w:val="single" w:sz="4" w:space="0" w:color="8C8C8C"/>
@@ -16959,7 +16983,7 @@
       <w:tr>
         <w:tc>
           <w:tcPr>
-            <w:tcW w:type="dxa" w:w="2299"/>
+            <w:tcW w:type="dxa" w:w="2187"/>
             <w:tcBorders>
               <w:top w:val="single" w:sz="4" w:space="0" w:color="8C8C8C"/>
               <w:left w:val="single" w:sz="4" w:space="0" w:color="8C8C8C"/>
@@ -16987,7 +17011,7 @@
         </w:tc>
         <w:tc>
           <w:tcPr>
-            <w:tcW w:type="dxa" w:w="3364"/>
+            <w:tcW w:type="dxa" w:w="2774"/>
             <w:tcBorders>
               <w:top w:val="single" w:sz="4" w:space="0" w:color="8C8C8C"/>
               <w:left w:val="single" w:sz="4" w:space="0" w:color="8C8C8C"/>
@@ -17015,7 +17039,7 @@
         </w:tc>
         <w:tc>
           <w:tcPr>
-            <w:tcW w:type="dxa" w:w="3364"/>
+            <w:tcW w:type="dxa" w:w="4065"/>
             <w:tcBorders>
               <w:top w:val="single" w:sz="4" w:space="0" w:color="8C8C8C"/>
               <w:left w:val="single" w:sz="4" w:space="0" w:color="8C8C8C"/>
@@ -17046,7 +17070,7 @@
       <w:tr>
         <w:tc>
           <w:tcPr>
-            <w:tcW w:type="dxa" w:w="2299"/>
+            <w:tcW w:type="dxa" w:w="2187"/>
             <w:tcBorders>
               <w:top w:val="single" w:sz="4" w:space="0" w:color="8C8C8C"/>
               <w:left w:val="single" w:sz="4" w:space="0" w:color="8C8C8C"/>
@@ -17074,7 +17098,7 @@
         </w:tc>
         <w:tc>
           <w:tcPr>
-            <w:tcW w:type="dxa" w:w="3364"/>
+            <w:tcW w:type="dxa" w:w="2774"/>
             <w:tcBorders>
               <w:top w:val="single" w:sz="4" w:space="0" w:color="8C8C8C"/>
               <w:left w:val="single" w:sz="4" w:space="0" w:color="8C8C8C"/>
@@ -17116,7 +17140,7 @@
         </w:tc>
         <w:tc>
           <w:tcPr>
-            <w:tcW w:type="dxa" w:w="3364"/>
+            <w:tcW w:type="dxa" w:w="4065"/>
             <w:tcBorders>
               <w:top w:val="single" w:sz="4" w:space="0" w:color="8C8C8C"/>
               <w:left w:val="single" w:sz="4" w:space="0" w:color="8C8C8C"/>
@@ -17147,7 +17171,7 @@
       <w:tr>
         <w:tc>
           <w:tcPr>
-            <w:tcW w:type="dxa" w:w="2299"/>
+            <w:tcW w:type="dxa" w:w="2187"/>
             <w:tcBorders>
               <w:top w:val="single" w:sz="4" w:space="0" w:color="8C8C8C"/>
               <w:left w:val="single" w:sz="4" w:space="0" w:color="8C8C8C"/>
@@ -17175,7 +17199,7 @@
         </w:tc>
         <w:tc>
           <w:tcPr>
-            <w:tcW w:type="dxa" w:w="3364"/>
+            <w:tcW w:type="dxa" w:w="2774"/>
             <w:tcBorders>
               <w:top w:val="single" w:sz="4" w:space="0" w:color="8C8C8C"/>
               <w:left w:val="single" w:sz="4" w:space="0" w:color="8C8C8C"/>
@@ -17203,7 +17227,7 @@
         </w:tc>
         <w:tc>
           <w:tcPr>
-            <w:tcW w:type="dxa" w:w="3364"/>
+            <w:tcW w:type="dxa" w:w="4065"/>
             <w:tcBorders>
               <w:top w:val="single" w:sz="4" w:space="0" w:color="8C8C8C"/>
               <w:left w:val="single" w:sz="4" w:space="0" w:color="8C8C8C"/>
@@ -17253,7 +17277,7 @@
       <w:tr>
         <w:tc>
           <w:tcPr>
-            <w:tcW w:type="dxa" w:w="2299"/>
+            <w:tcW w:type="dxa" w:w="2187"/>
             <w:tcBorders>
               <w:top w:val="single" w:sz="4" w:space="0" w:color="8C8C8C"/>
               <w:left w:val="single" w:sz="4" w:space="0" w:color="8C8C8C"/>
@@ -17281,7 +17305,7 @@
         </w:tc>
         <w:tc>
           <w:tcPr>
-            <w:tcW w:type="dxa" w:w="3364"/>
+            <w:tcW w:type="dxa" w:w="2774"/>
             <w:tcBorders>
               <w:top w:val="single" w:sz="4" w:space="0" w:color="8C8C8C"/>
               <w:left w:val="single" w:sz="4" w:space="0" w:color="8C8C8C"/>
@@ -17309,7 +17333,7 @@
         </w:tc>
         <w:tc>
           <w:tcPr>
-            <w:tcW w:type="dxa" w:w="3364"/>
+            <w:tcW w:type="dxa" w:w="4065"/>
             <w:tcBorders>
               <w:top w:val="single" w:sz="4" w:space="0" w:color="8C8C8C"/>
               <w:left w:val="single" w:sz="4" w:space="0" w:color="8C8C8C"/>
@@ -17346,7 +17370,7 @@
       <w:tr>
         <w:tc>
           <w:tcPr>
-            <w:tcW w:type="dxa" w:w="2299"/>
+            <w:tcW w:type="dxa" w:w="2187"/>
             <w:tcBorders>
               <w:top w:val="single" w:sz="4" w:space="0" w:color="8C8C8C"/>
               <w:left w:val="single" w:sz="4" w:space="0" w:color="8C8C8C"/>
@@ -17374,7 +17398,7 @@
         </w:tc>
         <w:tc>
           <w:tcPr>
-            <w:tcW w:type="dxa" w:w="3364"/>
+            <w:tcW w:type="dxa" w:w="2774"/>
             <w:tcBorders>
               <w:top w:val="single" w:sz="4" w:space="0" w:color="8C8C8C"/>
               <w:left w:val="single" w:sz="4" w:space="0" w:color="8C8C8C"/>
@@ -17402,7 +17426,7 @@
         </w:tc>
         <w:tc>
           <w:tcPr>
-            <w:tcW w:type="dxa" w:w="3364"/>
+            <w:tcW w:type="dxa" w:w="4065"/>
             <w:tcBorders>
               <w:top w:val="single" w:sz="4" w:space="0" w:color="8C8C8C"/>
               <w:left w:val="single" w:sz="4" w:space="0" w:color="8C8C8C"/>
@@ -17863,17 +17887,19 @@
       <w:tblPr>
         <w:tblW w:type="auto" w:w="0"/>
         <w:jc w:val="center"/>
+        <w:tblLayout w:type="fixed"/>
         <w:tblLook w:firstColumn="1" w:firstRow="1" w:lastColumn="0" w:lastRow="0" w:noHBand="0" w:noVBand="1" w:val="04A0"/>
+        <w:tblLayout w:type="fixed"/>
       </w:tblPr>
       <w:tblGrid>
-        <w:gridCol w:w="3009"/>
-        <w:gridCol w:w="3009"/>
-        <w:gridCol w:w="3009"/>
+        <w:gridCol w:w="3861"/>
+        <w:gridCol w:w="4197"/>
+        <w:gridCol w:w="968"/>
       </w:tblGrid>
       <w:tr>
         <w:tc>
           <w:tcPr>
-            <w:tcW w:type="dxa" w:w="3472"/>
+            <w:tcW w:type="dxa" w:w="3861"/>
             <w:tcBorders>
               <w:top w:val="single" w:sz="4" w:space="0" w:color="8C8C8C"/>
               <w:left w:val="single" w:sz="4" w:space="0" w:color="8C8C8C"/>
@@ -17903,7 +17929,7 @@
         </w:tc>
         <w:tc>
           <w:tcPr>
-            <w:tcW w:type="dxa" w:w="3472"/>
+            <w:tcW w:type="dxa" w:w="4197"/>
             <w:tcBorders>
               <w:top w:val="single" w:sz="4" w:space="0" w:color="8C8C8C"/>
               <w:left w:val="single" w:sz="4" w:space="0" w:color="8C8C8C"/>
@@ -17933,7 +17959,7 @@
         </w:tc>
         <w:tc>
           <w:tcPr>
-            <w:tcW w:type="dxa" w:w="2083"/>
+            <w:tcW w:type="dxa" w:w="968"/>
             <w:tcBorders>
               <w:top w:val="single" w:sz="4" w:space="0" w:color="8C8C8C"/>
               <w:left w:val="single" w:sz="4" w:space="0" w:color="8C8C8C"/>
@@ -17965,7 +17991,7 @@
       <w:tr>
         <w:tc>
           <w:tcPr>
-            <w:tcW w:type="dxa" w:w="3472"/>
+            <w:tcW w:type="dxa" w:w="3861"/>
             <w:tcBorders>
               <w:top w:val="single" w:sz="4" w:space="0" w:color="8C8C8C"/>
               <w:left w:val="single" w:sz="4" w:space="0" w:color="8C8C8C"/>
@@ -17993,7 +18019,7 @@
         </w:tc>
         <w:tc>
           <w:tcPr>
-            <w:tcW w:type="dxa" w:w="3472"/>
+            <w:tcW w:type="dxa" w:w="4197"/>
             <w:tcBorders>
               <w:top w:val="single" w:sz="4" w:space="0" w:color="8C8C8C"/>
               <w:left w:val="single" w:sz="4" w:space="0" w:color="8C8C8C"/>
@@ -18067,7 +18093,7 @@
         </w:tc>
         <w:tc>
           <w:tcPr>
-            <w:tcW w:type="dxa" w:w="2083"/>
+            <w:tcW w:type="dxa" w:w="968"/>
             <w:tcBorders>
               <w:top w:val="single" w:sz="4" w:space="0" w:color="8C8C8C"/>
               <w:left w:val="single" w:sz="4" w:space="0" w:color="8C8C8C"/>
@@ -18097,7 +18123,7 @@
       <w:tr>
         <w:tc>
           <w:tcPr>
-            <w:tcW w:type="dxa" w:w="3472"/>
+            <w:tcW w:type="dxa" w:w="3861"/>
             <w:tcBorders>
               <w:top w:val="single" w:sz="4" w:space="0" w:color="8C8C8C"/>
               <w:left w:val="single" w:sz="4" w:space="0" w:color="8C8C8C"/>
@@ -18125,7 +18151,7 @@
         </w:tc>
         <w:tc>
           <w:tcPr>
-            <w:tcW w:type="dxa" w:w="3472"/>
+            <w:tcW w:type="dxa" w:w="4197"/>
             <w:tcBorders>
               <w:top w:val="single" w:sz="4" w:space="0" w:color="8C8C8C"/>
               <w:left w:val="single" w:sz="4" w:space="0" w:color="8C8C8C"/>
@@ -18180,7 +18206,7 @@
         </w:tc>
         <w:tc>
           <w:tcPr>
-            <w:tcW w:type="dxa" w:w="2083"/>
+            <w:tcW w:type="dxa" w:w="968"/>
             <w:tcBorders>
               <w:top w:val="single" w:sz="4" w:space="0" w:color="8C8C8C"/>
               <w:left w:val="single" w:sz="4" w:space="0" w:color="8C8C8C"/>
@@ -18210,7 +18236,7 @@
       <w:tr>
         <w:tc>
           <w:tcPr>
-            <w:tcW w:type="dxa" w:w="3472"/>
+            <w:tcW w:type="dxa" w:w="3861"/>
             <w:tcBorders>
               <w:top w:val="single" w:sz="4" w:space="0" w:color="8C8C8C"/>
               <w:left w:val="single" w:sz="4" w:space="0" w:color="8C8C8C"/>
@@ -18238,7 +18264,7 @@
         </w:tc>
         <w:tc>
           <w:tcPr>
-            <w:tcW w:type="dxa" w:w="3472"/>
+            <w:tcW w:type="dxa" w:w="4197"/>
             <w:tcBorders>
               <w:top w:val="single" w:sz="4" w:space="0" w:color="8C8C8C"/>
               <w:left w:val="single" w:sz="4" w:space="0" w:color="8C8C8C"/>
@@ -18332,7 +18358,7 @@
         </w:tc>
         <w:tc>
           <w:tcPr>
-            <w:tcW w:type="dxa" w:w="2083"/>
+            <w:tcW w:type="dxa" w:w="968"/>
             <w:tcBorders>
               <w:top w:val="single" w:sz="4" w:space="0" w:color="8C8C8C"/>
               <w:left w:val="single" w:sz="4" w:space="0" w:color="8C8C8C"/>
@@ -18362,7 +18388,7 @@
       <w:tr>
         <w:tc>
           <w:tcPr>
-            <w:tcW w:type="dxa" w:w="3472"/>
+            <w:tcW w:type="dxa" w:w="3861"/>
             <w:tcBorders>
               <w:top w:val="single" w:sz="4" w:space="0" w:color="8C8C8C"/>
               <w:left w:val="single" w:sz="4" w:space="0" w:color="8C8C8C"/>
@@ -18390,7 +18416,7 @@
         </w:tc>
         <w:tc>
           <w:tcPr>
-            <w:tcW w:type="dxa" w:w="3472"/>
+            <w:tcW w:type="dxa" w:w="4197"/>
             <w:tcBorders>
               <w:top w:val="single" w:sz="4" w:space="0" w:color="8C8C8C"/>
               <w:left w:val="single" w:sz="4" w:space="0" w:color="8C8C8C"/>
@@ -18451,7 +18477,7 @@
         </w:tc>
         <w:tc>
           <w:tcPr>
-            <w:tcW w:type="dxa" w:w="2083"/>
+            <w:tcW w:type="dxa" w:w="968"/>
             <w:tcBorders>
               <w:top w:val="single" w:sz="4" w:space="0" w:color="8C8C8C"/>
               <w:left w:val="single" w:sz="4" w:space="0" w:color="8C8C8C"/>
@@ -18481,7 +18507,7 @@
       <w:tr>
         <w:tc>
           <w:tcPr>
-            <w:tcW w:type="dxa" w:w="3472"/>
+            <w:tcW w:type="dxa" w:w="3861"/>
             <w:tcBorders>
               <w:top w:val="single" w:sz="4" w:space="0" w:color="8C8C8C"/>
               <w:left w:val="single" w:sz="4" w:space="0" w:color="8C8C8C"/>
@@ -18509,7 +18535,7 @@
         </w:tc>
         <w:tc>
           <w:tcPr>
-            <w:tcW w:type="dxa" w:w="3472"/>
+            <w:tcW w:type="dxa" w:w="4197"/>
             <w:tcBorders>
               <w:top w:val="single" w:sz="4" w:space="0" w:color="8C8C8C"/>
               <w:left w:val="single" w:sz="4" w:space="0" w:color="8C8C8C"/>
@@ -18596,7 +18622,7 @@
         </w:tc>
         <w:tc>
           <w:tcPr>
-            <w:tcW w:type="dxa" w:w="2083"/>
+            <w:tcW w:type="dxa" w:w="968"/>
             <w:tcBorders>
               <w:top w:val="single" w:sz="4" w:space="0" w:color="8C8C8C"/>
               <w:left w:val="single" w:sz="4" w:space="0" w:color="8C8C8C"/>
@@ -18626,7 +18652,7 @@
       <w:tr>
         <w:tc>
           <w:tcPr>
-            <w:tcW w:type="dxa" w:w="3472"/>
+            <w:tcW w:type="dxa" w:w="3861"/>
             <w:tcBorders>
               <w:top w:val="single" w:sz="4" w:space="0" w:color="8C8C8C"/>
               <w:left w:val="single" w:sz="4" w:space="0" w:color="8C8C8C"/>
@@ -18654,7 +18680,7 @@
         </w:tc>
         <w:tc>
           <w:tcPr>
-            <w:tcW w:type="dxa" w:w="3472"/>
+            <w:tcW w:type="dxa" w:w="4197"/>
             <w:tcBorders>
               <w:top w:val="single" w:sz="4" w:space="0" w:color="8C8C8C"/>
               <w:left w:val="single" w:sz="4" w:space="0" w:color="8C8C8C"/>
@@ -18748,7 +18774,7 @@
         </w:tc>
         <w:tc>
           <w:tcPr>
-            <w:tcW w:type="dxa" w:w="2083"/>
+            <w:tcW w:type="dxa" w:w="968"/>
             <w:tcBorders>
               <w:top w:val="single" w:sz="4" w:space="0" w:color="8C8C8C"/>
               <w:left w:val="single" w:sz="4" w:space="0" w:color="8C8C8C"/>
@@ -18778,7 +18804,7 @@
       <w:tr>
         <w:tc>
           <w:tcPr>
-            <w:tcW w:type="dxa" w:w="3472"/>
+            <w:tcW w:type="dxa" w:w="3861"/>
             <w:tcBorders>
               <w:top w:val="single" w:sz="4" w:space="0" w:color="8C8C8C"/>
               <w:left w:val="single" w:sz="4" w:space="0" w:color="8C8C8C"/>
@@ -18806,7 +18832,7 @@
         </w:tc>
         <w:tc>
           <w:tcPr>
-            <w:tcW w:type="dxa" w:w="3472"/>
+            <w:tcW w:type="dxa" w:w="4197"/>
             <w:tcBorders>
               <w:top w:val="single" w:sz="4" w:space="0" w:color="8C8C8C"/>
               <w:left w:val="single" w:sz="4" w:space="0" w:color="8C8C8C"/>
@@ -18861,7 +18887,7 @@
         </w:tc>
         <w:tc>
           <w:tcPr>
-            <w:tcW w:type="dxa" w:w="2083"/>
+            <w:tcW w:type="dxa" w:w="968"/>
             <w:tcBorders>
               <w:top w:val="single" w:sz="4" w:space="0" w:color="8C8C8C"/>
               <w:left w:val="single" w:sz="4" w:space="0" w:color="8C8C8C"/>
@@ -18891,7 +18917,7 @@
       <w:tr>
         <w:tc>
           <w:tcPr>
-            <w:tcW w:type="dxa" w:w="3472"/>
+            <w:tcW w:type="dxa" w:w="3861"/>
             <w:tcBorders>
               <w:top w:val="single" w:sz="4" w:space="0" w:color="8C8C8C"/>
               <w:left w:val="single" w:sz="4" w:space="0" w:color="8C8C8C"/>
@@ -18919,7 +18945,7 @@
         </w:tc>
         <w:tc>
           <w:tcPr>
-            <w:tcW w:type="dxa" w:w="3472"/>
+            <w:tcW w:type="dxa" w:w="4197"/>
             <w:tcBorders>
               <w:top w:val="single" w:sz="4" w:space="0" w:color="8C8C8C"/>
               <w:left w:val="single" w:sz="4" w:space="0" w:color="8C8C8C"/>
@@ -18961,7 +18987,7 @@
         </w:tc>
         <w:tc>
           <w:tcPr>
-            <w:tcW w:type="dxa" w:w="2083"/>
+            <w:tcW w:type="dxa" w:w="968"/>
             <w:tcBorders>
               <w:top w:val="single" w:sz="4" w:space="0" w:color="8C8C8C"/>
               <w:left w:val="single" w:sz="4" w:space="0" w:color="8C8C8C"/>
@@ -18991,7 +19017,7 @@
       <w:tr>
         <w:tc>
           <w:tcPr>
-            <w:tcW w:type="dxa" w:w="3472"/>
+            <w:tcW w:type="dxa" w:w="3861"/>
             <w:tcBorders>
               <w:top w:val="single" w:sz="4" w:space="0" w:color="8C8C8C"/>
               <w:left w:val="single" w:sz="4" w:space="0" w:color="8C8C8C"/>
@@ -19019,7 +19045,7 @@
         </w:tc>
         <w:tc>
           <w:tcPr>
-            <w:tcW w:type="dxa" w:w="3472"/>
+            <w:tcW w:type="dxa" w:w="4197"/>
             <w:tcBorders>
               <w:top w:val="single" w:sz="4" w:space="0" w:color="8C8C8C"/>
               <w:left w:val="single" w:sz="4" w:space="0" w:color="8C8C8C"/>
@@ -19093,7 +19119,7 @@
         </w:tc>
         <w:tc>
           <w:tcPr>
-            <w:tcW w:type="dxa" w:w="2083"/>
+            <w:tcW w:type="dxa" w:w="968"/>
             <w:tcBorders>
               <w:top w:val="single" w:sz="4" w:space="0" w:color="8C8C8C"/>
               <w:left w:val="single" w:sz="4" w:space="0" w:color="8C8C8C"/>
@@ -19123,7 +19149,7 @@
       <w:tr>
         <w:tc>
           <w:tcPr>
-            <w:tcW w:type="dxa" w:w="3472"/>
+            <w:tcW w:type="dxa" w:w="3861"/>
             <w:tcBorders>
               <w:top w:val="single" w:sz="4" w:space="0" w:color="8C8C8C"/>
               <w:left w:val="single" w:sz="4" w:space="0" w:color="8C8C8C"/>
@@ -19151,7 +19177,7 @@
         </w:tc>
         <w:tc>
           <w:tcPr>
-            <w:tcW w:type="dxa" w:w="3472"/>
+            <w:tcW w:type="dxa" w:w="4197"/>
             <w:tcBorders>
               <w:top w:val="single" w:sz="4" w:space="0" w:color="8C8C8C"/>
               <w:left w:val="single" w:sz="4" w:space="0" w:color="8C8C8C"/>
@@ -19199,7 +19225,7 @@
         </w:tc>
         <w:tc>
           <w:tcPr>
-            <w:tcW w:type="dxa" w:w="2083"/>
+            <w:tcW w:type="dxa" w:w="968"/>
             <w:tcBorders>
               <w:top w:val="single" w:sz="4" w:space="0" w:color="8C8C8C"/>
               <w:left w:val="single" w:sz="4" w:space="0" w:color="8C8C8C"/>
@@ -19229,7 +19255,7 @@
       <w:tr>
         <w:tc>
           <w:tcPr>
-            <w:tcW w:type="dxa" w:w="3472"/>
+            <w:tcW w:type="dxa" w:w="3861"/>
             <w:tcBorders>
               <w:top w:val="single" w:sz="4" w:space="0" w:color="8C8C8C"/>
               <w:left w:val="single" w:sz="4" w:space="0" w:color="8C8C8C"/>
@@ -19257,7 +19283,7 @@
         </w:tc>
         <w:tc>
           <w:tcPr>
-            <w:tcW w:type="dxa" w:w="3472"/>
+            <w:tcW w:type="dxa" w:w="4197"/>
             <w:tcBorders>
               <w:top w:val="single" w:sz="4" w:space="0" w:color="8C8C8C"/>
               <w:left w:val="single" w:sz="4" w:space="0" w:color="8C8C8C"/>
@@ -19318,7 +19344,7 @@
         </w:tc>
         <w:tc>
           <w:tcPr>
-            <w:tcW w:type="dxa" w:w="2083"/>
+            <w:tcW w:type="dxa" w:w="968"/>
             <w:tcBorders>
               <w:top w:val="single" w:sz="4" w:space="0" w:color="8C8C8C"/>
               <w:left w:val="single" w:sz="4" w:space="0" w:color="8C8C8C"/>
@@ -19348,7 +19374,7 @@
       <w:tr>
         <w:tc>
           <w:tcPr>
-            <w:tcW w:type="dxa" w:w="3472"/>
+            <w:tcW w:type="dxa" w:w="3861"/>
             <w:tcBorders>
               <w:top w:val="single" w:sz="4" w:space="0" w:color="8C8C8C"/>
               <w:left w:val="single" w:sz="4" w:space="0" w:color="8C8C8C"/>
@@ -19376,7 +19402,7 @@
         </w:tc>
         <w:tc>
           <w:tcPr>
-            <w:tcW w:type="dxa" w:w="3472"/>
+            <w:tcW w:type="dxa" w:w="4197"/>
             <w:tcBorders>
               <w:top w:val="single" w:sz="4" w:space="0" w:color="8C8C8C"/>
               <w:left w:val="single" w:sz="4" w:space="0" w:color="8C8C8C"/>
@@ -19437,7 +19463,7 @@
         </w:tc>
         <w:tc>
           <w:tcPr>
-            <w:tcW w:type="dxa" w:w="2083"/>
+            <w:tcW w:type="dxa" w:w="968"/>
             <w:tcBorders>
               <w:top w:val="single" w:sz="4" w:space="0" w:color="8C8C8C"/>
               <w:left w:val="single" w:sz="4" w:space="0" w:color="8C8C8C"/>
@@ -19467,7 +19493,7 @@
       <w:tr>
         <w:tc>
           <w:tcPr>
-            <w:tcW w:type="dxa" w:w="3472"/>
+            <w:tcW w:type="dxa" w:w="3861"/>
             <w:tcBorders>
               <w:top w:val="single" w:sz="4" w:space="0" w:color="8C8C8C"/>
               <w:left w:val="single" w:sz="4" w:space="0" w:color="8C8C8C"/>
@@ -19495,7 +19521,7 @@
         </w:tc>
         <w:tc>
           <w:tcPr>
-            <w:tcW w:type="dxa" w:w="3472"/>
+            <w:tcW w:type="dxa" w:w="4197"/>
             <w:tcBorders>
               <w:top w:val="single" w:sz="4" w:space="0" w:color="8C8C8C"/>
               <w:left w:val="single" w:sz="4" w:space="0" w:color="8C8C8C"/>
@@ -19569,7 +19595,7 @@
         </w:tc>
         <w:tc>
           <w:tcPr>
-            <w:tcW w:type="dxa" w:w="2083"/>
+            <w:tcW w:type="dxa" w:w="968"/>
             <w:tcBorders>
               <w:top w:val="single" w:sz="4" w:space="0" w:color="8C8C8C"/>
               <w:left w:val="single" w:sz="4" w:space="0" w:color="8C8C8C"/>
@@ -19623,17 +19649,19 @@
       <w:tblPr>
         <w:tblW w:type="auto" w:w="0"/>
         <w:jc w:val="center"/>
+        <w:tblLayout w:type="fixed"/>
         <w:tblLook w:firstColumn="1" w:firstRow="1" w:lastColumn="0" w:lastRow="0" w:noHBand="0" w:noVBand="1" w:val="04A0"/>
+        <w:tblLayout w:type="fixed"/>
       </w:tblPr>
       <w:tblGrid>
-        <w:gridCol w:w="3009"/>
-        <w:gridCol w:w="3009"/>
-        <w:gridCol w:w="3009"/>
+        <w:gridCol w:w="894"/>
+        <w:gridCol w:w="4066"/>
+        <w:gridCol w:w="4066"/>
       </w:tblGrid>
       <w:tr>
         <w:tc>
           <w:tcPr>
-            <w:tcW w:type="dxa" w:w="430"/>
+            <w:tcW w:type="dxa" w:w="894"/>
             <w:tcBorders>
               <w:top w:val="single" w:sz="4" w:space="0" w:color="8C8C8C"/>
               <w:left w:val="single" w:sz="4" w:space="0" w:color="8C8C8C"/>
@@ -19663,7 +19691,7 @@
         </w:tc>
         <w:tc>
           <w:tcPr>
-            <w:tcW w:type="dxa" w:w="4298"/>
+            <w:tcW w:type="dxa" w:w="4066"/>
             <w:tcBorders>
               <w:top w:val="single" w:sz="4" w:space="0" w:color="8C8C8C"/>
               <w:left w:val="single" w:sz="4" w:space="0" w:color="8C8C8C"/>
@@ -19693,7 +19721,7 @@
         </w:tc>
         <w:tc>
           <w:tcPr>
-            <w:tcW w:type="dxa" w:w="4298"/>
+            <w:tcW w:type="dxa" w:w="4066"/>
             <w:tcBorders>
               <w:top w:val="single" w:sz="4" w:space="0" w:color="8C8C8C"/>
               <w:left w:val="single" w:sz="4" w:space="0" w:color="8C8C8C"/>
@@ -19725,7 +19753,7 @@
       <w:tr>
         <w:tc>
           <w:tcPr>
-            <w:tcW w:type="dxa" w:w="430"/>
+            <w:tcW w:type="dxa" w:w="894"/>
             <w:tcBorders>
               <w:top w:val="single" w:sz="4" w:space="0" w:color="8C8C8C"/>
               <w:left w:val="single" w:sz="4" w:space="0" w:color="8C8C8C"/>
@@ -19753,7 +19781,7 @@
         </w:tc>
         <w:tc>
           <w:tcPr>
-            <w:tcW w:type="dxa" w:w="4298"/>
+            <w:tcW w:type="dxa" w:w="4066"/>
             <w:tcBorders>
               <w:top w:val="single" w:sz="4" w:space="0" w:color="8C8C8C"/>
               <w:left w:val="single" w:sz="4" w:space="0" w:color="8C8C8C"/>
@@ -19788,7 +19816,7 @@
         </w:tc>
         <w:tc>
           <w:tcPr>
-            <w:tcW w:type="dxa" w:w="4298"/>
+            <w:tcW w:type="dxa" w:w="4066"/>
             <w:tcBorders>
               <w:top w:val="single" w:sz="4" w:space="0" w:color="8C8C8C"/>
               <w:left w:val="single" w:sz="4" w:space="0" w:color="8C8C8C"/>
@@ -19877,7 +19905,7 @@
       <w:tr>
         <w:tc>
           <w:tcPr>
-            <w:tcW w:type="dxa" w:w="430"/>
+            <w:tcW w:type="dxa" w:w="894"/>
             <w:tcBorders>
               <w:top w:val="single" w:sz="4" w:space="0" w:color="8C8C8C"/>
               <w:left w:val="single" w:sz="4" w:space="0" w:color="8C8C8C"/>
@@ -19905,7 +19933,7 @@
         </w:tc>
         <w:tc>
           <w:tcPr>
-            <w:tcW w:type="dxa" w:w="4298"/>
+            <w:tcW w:type="dxa" w:w="4066"/>
             <w:tcBorders>
               <w:top w:val="single" w:sz="4" w:space="0" w:color="8C8C8C"/>
               <w:left w:val="single" w:sz="4" w:space="0" w:color="8C8C8C"/>
@@ -19959,7 +19987,7 @@
         </w:tc>
         <w:tc>
           <w:tcPr>
-            <w:tcW w:type="dxa" w:w="4298"/>
+            <w:tcW w:type="dxa" w:w="4066"/>
             <w:tcBorders>
               <w:top w:val="single" w:sz="4" w:space="0" w:color="8C8C8C"/>
               <w:left w:val="single" w:sz="4" w:space="0" w:color="8C8C8C"/>
@@ -20022,7 +20050,7 @@
       <w:tr>
         <w:tc>
           <w:tcPr>
-            <w:tcW w:type="dxa" w:w="430"/>
+            <w:tcW w:type="dxa" w:w="894"/>
             <w:tcBorders>
               <w:top w:val="single" w:sz="4" w:space="0" w:color="8C8C8C"/>
               <w:left w:val="single" w:sz="4" w:space="0" w:color="8C8C8C"/>
@@ -20050,7 +20078,7 @@
         </w:tc>
         <w:tc>
           <w:tcPr>
-            <w:tcW w:type="dxa" w:w="4298"/>
+            <w:tcW w:type="dxa" w:w="4066"/>
             <w:tcBorders>
               <w:top w:val="single" w:sz="4" w:space="0" w:color="8C8C8C"/>
               <w:left w:val="single" w:sz="4" w:space="0" w:color="8C8C8C"/>
@@ -20078,7 +20106,7 @@
         </w:tc>
         <w:tc>
           <w:tcPr>
-            <w:tcW w:type="dxa" w:w="4298"/>
+            <w:tcW w:type="dxa" w:w="4066"/>
             <w:tcBorders>
               <w:top w:val="single" w:sz="4" w:space="0" w:color="8C8C8C"/>
               <w:left w:val="single" w:sz="4" w:space="0" w:color="8C8C8C"/>
@@ -20121,7 +20149,7 @@
       <w:tr>
         <w:tc>
           <w:tcPr>
-            <w:tcW w:type="dxa" w:w="430"/>
+            <w:tcW w:type="dxa" w:w="894"/>
             <w:tcBorders>
               <w:top w:val="single" w:sz="4" w:space="0" w:color="8C8C8C"/>
               <w:left w:val="single" w:sz="4" w:space="0" w:color="8C8C8C"/>
@@ -20149,7 +20177,7 @@
         </w:tc>
         <w:tc>
           <w:tcPr>
-            <w:tcW w:type="dxa" w:w="4298"/>
+            <w:tcW w:type="dxa" w:w="4066"/>
             <w:tcBorders>
               <w:top w:val="single" w:sz="4" w:space="0" w:color="8C8C8C"/>
               <w:left w:val="single" w:sz="4" w:space="0" w:color="8C8C8C"/>
@@ -20203,7 +20231,7 @@
         </w:tc>
         <w:tc>
           <w:tcPr>
-            <w:tcW w:type="dxa" w:w="4298"/>
+            <w:tcW w:type="dxa" w:w="4066"/>
             <w:tcBorders>
               <w:top w:val="single" w:sz="4" w:space="0" w:color="8C8C8C"/>
               <w:left w:val="single" w:sz="4" w:space="0" w:color="8C8C8C"/>
@@ -20253,7 +20281,7 @@
       <w:tr>
         <w:tc>
           <w:tcPr>
-            <w:tcW w:type="dxa" w:w="430"/>
+            <w:tcW w:type="dxa" w:w="894"/>
             <w:tcBorders>
               <w:top w:val="single" w:sz="4" w:space="0" w:color="8C8C8C"/>
               <w:left w:val="single" w:sz="4" w:space="0" w:color="8C8C8C"/>
@@ -20281,7 +20309,7 @@
         </w:tc>
         <w:tc>
           <w:tcPr>
-            <w:tcW w:type="dxa" w:w="4298"/>
+            <w:tcW w:type="dxa" w:w="4066"/>
             <w:tcBorders>
               <w:top w:val="single" w:sz="4" w:space="0" w:color="8C8C8C"/>
               <w:left w:val="single" w:sz="4" w:space="0" w:color="8C8C8C"/>
@@ -20316,7 +20344,7 @@
         </w:tc>
         <w:tc>
           <w:tcPr>
-            <w:tcW w:type="dxa" w:w="4298"/>
+            <w:tcW w:type="dxa" w:w="4066"/>
             <w:tcBorders>
               <w:top w:val="single" w:sz="4" w:space="0" w:color="8C8C8C"/>
               <w:left w:val="single" w:sz="4" w:space="0" w:color="8C8C8C"/>
@@ -20418,7 +20446,7 @@
       <w:tr>
         <w:tc>
           <w:tcPr>
-            <w:tcW w:type="dxa" w:w="430"/>
+            <w:tcW w:type="dxa" w:w="894"/>
             <w:tcBorders>
               <w:top w:val="single" w:sz="4" w:space="0" w:color="8C8C8C"/>
               <w:left w:val="single" w:sz="4" w:space="0" w:color="8C8C8C"/>
@@ -20446,7 +20474,7 @@
         </w:tc>
         <w:tc>
           <w:tcPr>
-            <w:tcW w:type="dxa" w:w="4298"/>
+            <w:tcW w:type="dxa" w:w="4066"/>
             <w:tcBorders>
               <w:top w:val="single" w:sz="4" w:space="0" w:color="8C8C8C"/>
               <w:left w:val="single" w:sz="4" w:space="0" w:color="8C8C8C"/>
@@ -20500,7 +20528,7 @@
         </w:tc>
         <w:tc>
           <w:tcPr>
-            <w:tcW w:type="dxa" w:w="4298"/>
+            <w:tcW w:type="dxa" w:w="4066"/>
             <w:tcBorders>
               <w:top w:val="single" w:sz="4" w:space="0" w:color="8C8C8C"/>
               <w:left w:val="single" w:sz="4" w:space="0" w:color="8C8C8C"/>
@@ -20602,7 +20630,7 @@
       <w:tr>
         <w:tc>
           <w:tcPr>
-            <w:tcW w:type="dxa" w:w="430"/>
+            <w:tcW w:type="dxa" w:w="894"/>
             <w:tcBorders>
               <w:top w:val="single" w:sz="4" w:space="0" w:color="8C8C8C"/>
               <w:left w:val="single" w:sz="4" w:space="0" w:color="8C8C8C"/>
@@ -20630,7 +20658,7 @@
         </w:tc>
         <w:tc>
           <w:tcPr>
-            <w:tcW w:type="dxa" w:w="4298"/>
+            <w:tcW w:type="dxa" w:w="4066"/>
             <w:tcBorders>
               <w:top w:val="single" w:sz="4" w:space="0" w:color="8C8C8C"/>
               <w:left w:val="single" w:sz="4" w:space="0" w:color="8C8C8C"/>
@@ -20658,7 +20686,7 @@
         </w:tc>
         <w:tc>
           <w:tcPr>
-            <w:tcW w:type="dxa" w:w="4298"/>
+            <w:tcW w:type="dxa" w:w="4066"/>
             <w:tcBorders>
               <w:top w:val="single" w:sz="4" w:space="0" w:color="8C8C8C"/>
               <w:left w:val="single" w:sz="4" w:space="0" w:color="8C8C8C"/>
@@ -20714,7 +20742,7 @@
       <w:tr>
         <w:tc>
           <w:tcPr>
-            <w:tcW w:type="dxa" w:w="430"/>
+            <w:tcW w:type="dxa" w:w="894"/>
             <w:tcBorders>
               <w:top w:val="single" w:sz="4" w:space="0" w:color="8C8C8C"/>
               <w:left w:val="single" w:sz="4" w:space="0" w:color="8C8C8C"/>
@@ -20742,7 +20770,7 @@
         </w:tc>
         <w:tc>
           <w:tcPr>
-            <w:tcW w:type="dxa" w:w="4298"/>
+            <w:tcW w:type="dxa" w:w="4066"/>
             <w:tcBorders>
               <w:top w:val="single" w:sz="4" w:space="0" w:color="8C8C8C"/>
               <w:left w:val="single" w:sz="4" w:space="0" w:color="8C8C8C"/>
@@ -20770,7 +20798,7 @@
         </w:tc>
         <w:tc>
           <w:tcPr>
-            <w:tcW w:type="dxa" w:w="4298"/>
+            <w:tcW w:type="dxa" w:w="4066"/>
             <w:tcBorders>
               <w:top w:val="single" w:sz="4" w:space="0" w:color="8C8C8C"/>
               <w:left w:val="single" w:sz="4" w:space="0" w:color="8C8C8C"/>
@@ -20813,7 +20841,7 @@
       <w:tr>
         <w:tc>
           <w:tcPr>
-            <w:tcW w:type="dxa" w:w="430"/>
+            <w:tcW w:type="dxa" w:w="894"/>
             <w:tcBorders>
               <w:top w:val="single" w:sz="4" w:space="0" w:color="8C8C8C"/>
               <w:left w:val="single" w:sz="4" w:space="0" w:color="8C8C8C"/>
@@ -20841,7 +20869,7 @@
         </w:tc>
         <w:tc>
           <w:tcPr>
-            <w:tcW w:type="dxa" w:w="4298"/>
+            <w:tcW w:type="dxa" w:w="4066"/>
             <w:tcBorders>
               <w:top w:val="single" w:sz="4" w:space="0" w:color="8C8C8C"/>
               <w:left w:val="single" w:sz="4" w:space="0" w:color="8C8C8C"/>
@@ -20869,7 +20897,7 @@
         </w:tc>
         <w:tc>
           <w:tcPr>
-            <w:tcW w:type="dxa" w:w="4298"/>
+            <w:tcW w:type="dxa" w:w="4066"/>
             <w:tcBorders>
               <w:top w:val="single" w:sz="4" w:space="0" w:color="8C8C8C"/>
               <w:left w:val="single" w:sz="4" w:space="0" w:color="8C8C8C"/>
@@ -20899,7 +20927,7 @@
       <w:tr>
         <w:tc>
           <w:tcPr>
-            <w:tcW w:type="dxa" w:w="430"/>
+            <w:tcW w:type="dxa" w:w="894"/>
             <w:tcBorders>
               <w:top w:val="single" w:sz="4" w:space="0" w:color="8C8C8C"/>
               <w:left w:val="single" w:sz="4" w:space="0" w:color="8C8C8C"/>
@@ -20927,7 +20955,7 @@
         </w:tc>
         <w:tc>
           <w:tcPr>
-            <w:tcW w:type="dxa" w:w="4298"/>
+            <w:tcW w:type="dxa" w:w="4066"/>
             <w:tcBorders>
               <w:top w:val="single" w:sz="4" w:space="0" w:color="8C8C8C"/>
               <w:left w:val="single" w:sz="4" w:space="0" w:color="8C8C8C"/>
@@ -20955,7 +20983,7 @@
         </w:tc>
         <w:tc>
           <w:tcPr>
-            <w:tcW w:type="dxa" w:w="4298"/>
+            <w:tcW w:type="dxa" w:w="4066"/>
             <w:tcBorders>
               <w:top w:val="single" w:sz="4" w:space="0" w:color="8C8C8C"/>
               <w:left w:val="single" w:sz="4" w:space="0" w:color="8C8C8C"/>

</xml_diff>

<commit_message>
docs(architecture): complete mutation operator list in §3
ARCHITECTURE.md §3 now lists every swap in mutation/operators.py: ROR
also swaps > and >=, constant replacement also swaps True and False,
and AOR also mutates augmented assignments (+=, -=, *=, /=). The SDD
§3.4 operator list is aligned with the same wording and its .docx is
rebuilt from the Markdown. No code or test file is changed.

Co-Authored-By: Claude Opus 5.5 <noreply@anthropic.com>
</commit_message>
<xml_diff>
--- a/docs/TestZede-SDD.docx
+++ b/docs/TestZede-SDD.docx
@@ -3915,13 +3915,112 @@
         <w:t>/</w:t>
       </w:r>
       <w:r>
+        <w:t xml:space="preserve">; </w:t>
+      </w:r>
+      <w:r>
+        <w:rPr>
+          <w:rFonts w:ascii="Consolas" w:hAnsi="Consolas"/>
+        </w:rPr>
+        <w:t>+=</w:t>
+      </w:r>
+      <w:r>
+        <w:t xml:space="preserve">, </w:t>
+      </w:r>
+      <w:r>
+        <w:rPr>
+          <w:rFonts w:ascii="Consolas" w:hAnsi="Consolas"/>
+        </w:rPr>
+        <w:t>-=</w:t>
+      </w:r>
+      <w:r>
+        <w:t xml:space="preserve">, </w:t>
+      </w:r>
+      <w:r>
+        <w:rPr>
+          <w:rFonts w:ascii="Consolas" w:hAnsi="Consolas"/>
+        </w:rPr>
+        <w:t>*=</w:t>
+      </w:r>
+      <w:r>
+        <w:t xml:space="preserve">, </w:t>
+      </w:r>
+      <w:r>
+        <w:rPr>
+          <w:rFonts w:ascii="Consolas" w:hAnsi="Consolas"/>
+        </w:rPr>
+        <w:t>/=</w:t>
+      </w:r>
+      <w:r>
+        <w:t xml:space="preserve"> dahil), </w:t>
+      </w:r>
+      <w:r>
+        <w:rPr>
+          <w:rFonts w:ascii="Consolas" w:hAnsi="Consolas"/>
+        </w:rPr>
+        <w:t>ROR</w:t>
+      </w:r>
+      <w:r>
+        <w:t xml:space="preserve"> (</w:t>
+      </w:r>
+      <w:r>
+        <w:rPr>
+          <w:rFonts w:ascii="Consolas" w:hAnsi="Consolas"/>
+        </w:rPr>
+        <w:t>&lt;</w:t>
+      </w:r>
+      <w:r>
+        <w:t>↔</w:t>
+      </w:r>
+      <w:r>
+        <w:rPr>
+          <w:rFonts w:ascii="Consolas" w:hAnsi="Consolas"/>
+        </w:rPr>
+        <w:t>&lt;=</w:t>
+      </w:r>
+      <w:r>
+        <w:t xml:space="preserve">, </w:t>
+      </w:r>
+      <w:r>
+        <w:rPr>
+          <w:rFonts w:ascii="Consolas" w:hAnsi="Consolas"/>
+        </w:rPr>
+        <w:t>&gt;</w:t>
+      </w:r>
+      <w:r>
+        <w:t>↔</w:t>
+      </w:r>
+      <w:r>
+        <w:rPr>
+          <w:rFonts w:ascii="Consolas" w:hAnsi="Consolas"/>
+        </w:rPr>
+        <w:t>&gt;=</w:t>
+      </w:r>
+      <w:r>
+        <w:t xml:space="preserve">, </w:t>
+      </w:r>
+      <w:r>
+        <w:rPr>
+          <w:rFonts w:ascii="Consolas" w:hAnsi="Consolas"/>
+        </w:rPr>
+        <w:t>==</w:t>
+      </w:r>
+      <w:r>
+        <w:t>↔</w:t>
+      </w:r>
+      <w:r>
+        <w:rPr>
+          <w:rFonts w:ascii="Consolas" w:hAnsi="Consolas"/>
+        </w:rPr>
+        <w:t>!=</w:t>
+      </w:r>
+      <w:r>
         <w:t xml:space="preserve">), </w:t>
       </w:r>
       <w:r>
         <w:rPr>
           <w:rFonts w:ascii="Consolas" w:hAnsi="Consolas"/>
         </w:rPr>
-        <w:t>ROR</w:t>
+        <w:t>COR</w:t>
       </w:r>
       <w:r>
         <w:t xml:space="preserve"> (</w:t>
@@ -3930,7 +4029,7 @@
         <w:rPr>
           <w:rFonts w:ascii="Consolas" w:hAnsi="Consolas"/>
         </w:rPr>
-        <w:t>&lt;</w:t>
+        <w:t>and</w:t>
       </w:r>
       <w:r>
         <w:t>↔</w:t>
@@ -3939,7 +4038,34 @@
         <w:rPr>
           <w:rFonts w:ascii="Consolas" w:hAnsi="Consolas"/>
         </w:rPr>
-        <w:t>&lt;=</w:t>
+        <w:t>or</w:t>
+      </w:r>
+      <w:r>
+        <w:t xml:space="preserve">), </w:t>
+      </w:r>
+      <w:r>
+        <w:rPr>
+          <w:rFonts w:ascii="Consolas" w:hAnsi="Consolas"/>
+        </w:rPr>
+        <w:t>CONST</w:t>
+      </w:r>
+      <w:r>
+        <w:t xml:space="preserve"> (sabit değiştirme: int </w:t>
+      </w:r>
+      <w:r>
+        <w:rPr>
+          <w:rFonts w:ascii="Consolas" w:hAnsi="Consolas"/>
+        </w:rPr>
+        <w:t>0</w:t>
+      </w:r>
+      <w:r>
+        <w:t>↔</w:t>
+      </w:r>
+      <w:r>
+        <w:rPr>
+          <w:rFonts w:ascii="Consolas" w:hAnsi="Consolas"/>
+        </w:rPr>
+        <w:t>1</w:t>
       </w:r>
       <w:r>
         <w:t xml:space="preserve">, </w:t>
@@ -3948,7 +4074,7 @@
         <w:rPr>
           <w:rFonts w:ascii="Consolas" w:hAnsi="Consolas"/>
         </w:rPr>
-        <w:t>&gt;</w:t>
+        <w:t>True</w:t>
       </w:r>
       <w:r>
         <w:t>↔</w:t>
@@ -3957,64 +4083,10 @@
         <w:rPr>
           <w:rFonts w:ascii="Consolas" w:hAnsi="Consolas"/>
         </w:rPr>
-        <w:t>&gt;=</w:t>
-      </w:r>
-      <w:r>
-        <w:t xml:space="preserve">, </w:t>
-      </w:r>
-      <w:r>
-        <w:rPr>
-          <w:rFonts w:ascii="Consolas" w:hAnsi="Consolas"/>
-        </w:rPr>
-        <w:t>==</w:t>
-      </w:r>
-      <w:r>
-        <w:t>↔</w:t>
-      </w:r>
-      <w:r>
-        <w:rPr>
-          <w:rFonts w:ascii="Consolas" w:hAnsi="Consolas"/>
-        </w:rPr>
-        <w:t>!=</w:t>
+        <w:t>False</w:t>
       </w:r>
       <w:r>
         <w:t xml:space="preserve">), </w:t>
-      </w:r>
-      <w:r>
-        <w:rPr>
-          <w:rFonts w:ascii="Consolas" w:hAnsi="Consolas"/>
-        </w:rPr>
-        <w:t>COR</w:t>
-      </w:r>
-      <w:r>
-        <w:t xml:space="preserve"> (</w:t>
-      </w:r>
-      <w:r>
-        <w:rPr>
-          <w:rFonts w:ascii="Consolas" w:hAnsi="Consolas"/>
-        </w:rPr>
-        <w:t>and</w:t>
-      </w:r>
-      <w:r>
-        <w:t>↔</w:t>
-      </w:r>
-      <w:r>
-        <w:rPr>
-          <w:rFonts w:ascii="Consolas" w:hAnsi="Consolas"/>
-        </w:rPr>
-        <w:t>or</w:t>
-      </w:r>
-      <w:r>
-        <w:t xml:space="preserve">), </w:t>
-      </w:r>
-      <w:r>
-        <w:rPr>
-          <w:rFonts w:ascii="Consolas" w:hAnsi="Consolas"/>
-        </w:rPr>
-        <w:t>CONST</w:t>
-      </w:r>
-      <w:r>
-        <w:t xml:space="preserve"> (sabit değiştirme), </w:t>
       </w:r>
       <w:r>
         <w:rPr>

</xml_diff>